<commit_message>
Added py file for connect to YandexSMTP
</commit_message>
<xml_diff>
--- a/tests/Ошибки в RentEase.docx
+++ b/tests/Ошибки в RentEase.docx
@@ -25,51 +25,7 @@
         <w:rPr>
           <w:lang w:val="en-US"/>
         </w:rPr>
-        <w:t xml:space="preserve">    result = </w:t>
-      </w:r>
-      <w:proofErr w:type="spellStart"/>
-      <w:proofErr w:type="gramStart"/>
-      <w:r>
-        <w:rPr>
-          <w:lang w:val="en-US"/>
-        </w:rPr>
-        <w:t>context.run</w:t>
-      </w:r>
-      <w:proofErr w:type="spellEnd"/>
-      <w:r>
-        <w:rPr>
-          <w:lang w:val="en-US"/>
-        </w:rPr>
-        <w:t>(</w:t>
-      </w:r>
-      <w:proofErr w:type="spellStart"/>
-      <w:proofErr w:type="gramEnd"/>
-      <w:r>
-        <w:rPr>
-          <w:lang w:val="en-US"/>
-        </w:rPr>
-        <w:t>func</w:t>
-      </w:r>
-      <w:proofErr w:type="spellEnd"/>
-      <w:r>
-        <w:rPr>
-          <w:lang w:val="en-US"/>
-        </w:rPr>
-        <w:t>, *</w:t>
-      </w:r>
-      <w:proofErr w:type="spellStart"/>
-      <w:r>
-        <w:rPr>
-          <w:lang w:val="en-US"/>
-        </w:rPr>
-        <w:t>args</w:t>
-      </w:r>
-      <w:proofErr w:type="spellEnd"/>
-      <w:r>
-        <w:rPr>
-          <w:lang w:val="en-US"/>
-        </w:rPr>
-        <w:t>)</w:t>
+        <w:t xml:space="preserve">    result = context.run(func, *args)</w:t>
       </w:r>
     </w:p>
     <w:p>
@@ -95,78 +51,20 @@
         <w:rPr>
           <w:lang w:val="en-US"/>
         </w:rPr>
-        <w:t xml:space="preserve">  File "C:\Users\vladi\AppData\Local\Programs\Python\Python312\Lib\site-packages\starlette\staticfiles.py", line 158, in </w:t>
-      </w:r>
-      <w:proofErr w:type="spellStart"/>
-      <w:r>
-        <w:rPr>
-          <w:lang w:val="en-US"/>
-        </w:rPr>
-        <w:t>lookup_path</w:t>
-      </w:r>
-      <w:proofErr w:type="spellEnd"/>
-    </w:p>
-    <w:p>
-      <w:pPr>
-        <w:rPr>
-          <w:lang w:val="en-US"/>
-        </w:rPr>
-      </w:pPr>
-      <w:r>
-        <w:rPr>
-          <w:lang w:val="en-US"/>
-        </w:rPr>
-        <w:t xml:space="preserve">    </w:t>
-      </w:r>
-      <w:proofErr w:type="spellStart"/>
-      <w:r>
-        <w:rPr>
-          <w:lang w:val="en-US"/>
-        </w:rPr>
-        <w:t>full_path</w:t>
-      </w:r>
-      <w:proofErr w:type="spellEnd"/>
-      <w:r>
-        <w:rPr>
-          <w:lang w:val="en-US"/>
-        </w:rPr>
-        <w:t xml:space="preserve"> = </w:t>
-      </w:r>
-      <w:proofErr w:type="spellStart"/>
-      <w:proofErr w:type="gramStart"/>
-      <w:r>
-        <w:rPr>
-          <w:lang w:val="en-US"/>
-        </w:rPr>
-        <w:t>os.path</w:t>
-      </w:r>
-      <w:proofErr w:type="gramEnd"/>
-      <w:r>
-        <w:rPr>
-          <w:lang w:val="en-US"/>
-        </w:rPr>
-        <w:t>.realpath</w:t>
-      </w:r>
-      <w:proofErr w:type="spellEnd"/>
-      <w:r>
-        <w:rPr>
-          <w:lang w:val="en-US"/>
-        </w:rPr>
-        <w:t>(</w:t>
-      </w:r>
-      <w:proofErr w:type="spellStart"/>
-      <w:r>
-        <w:rPr>
-          <w:lang w:val="en-US"/>
-        </w:rPr>
-        <w:t>joined_path</w:t>
-      </w:r>
-      <w:proofErr w:type="spellEnd"/>
-      <w:r>
-        <w:rPr>
-          <w:lang w:val="en-US"/>
-        </w:rPr>
-        <w:t>)</w:t>
+        <w:t xml:space="preserve">  File "C:\Users\vladi\AppData\Local\Programs\Python\Python312\Lib\site-packages\starlette\staticfiles.py", line 158, in lookup_path</w:t>
+      </w:r>
+    </w:p>
+    <w:p>
+      <w:pPr>
+        <w:rPr>
+          <w:lang w:val="en-US"/>
+        </w:rPr>
+      </w:pPr>
+      <w:r>
+        <w:rPr>
+          <w:lang w:val="en-US"/>
+        </w:rPr>
+        <w:t xml:space="preserve">    full_path = os.path.realpath(joined_path)</w:t>
       </w:r>
     </w:p>
     <w:p>
@@ -192,103 +90,30 @@
         <w:rPr>
           <w:lang w:val="en-US"/>
         </w:rPr>
-        <w:t xml:space="preserve">  File "&lt;frozen </w:t>
-      </w:r>
-      <w:proofErr w:type="spellStart"/>
-      <w:r>
-        <w:rPr>
-          <w:lang w:val="en-US"/>
-        </w:rPr>
-        <w:t>ntpath</w:t>
-      </w:r>
-      <w:proofErr w:type="spellEnd"/>
-      <w:r>
-        <w:rPr>
-          <w:lang w:val="en-US"/>
-        </w:rPr>
-        <w:t xml:space="preserve">&gt;", line 736, in </w:t>
-      </w:r>
-      <w:proofErr w:type="spellStart"/>
-      <w:r>
-        <w:rPr>
-          <w:lang w:val="en-US"/>
-        </w:rPr>
-        <w:t>realpath</w:t>
-      </w:r>
-      <w:proofErr w:type="spellEnd"/>
-    </w:p>
-    <w:p>
-      <w:pPr>
-        <w:rPr>
-          <w:lang w:val="en-US"/>
-        </w:rPr>
-      </w:pPr>
-      <w:r>
-        <w:rPr>
-          <w:lang w:val="en-US"/>
-        </w:rPr>
-        <w:t xml:space="preserve">  File "&lt;frozen </w:t>
-      </w:r>
-      <w:proofErr w:type="spellStart"/>
-      <w:r>
-        <w:rPr>
-          <w:lang w:val="en-US"/>
-        </w:rPr>
-        <w:t>ntpath</w:t>
-      </w:r>
-      <w:proofErr w:type="spellEnd"/>
-      <w:r>
-        <w:rPr>
-          <w:lang w:val="en-US"/>
-        </w:rPr>
-        <w:t>&gt;", line 676, in _</w:t>
-      </w:r>
-      <w:proofErr w:type="spellStart"/>
-      <w:r>
-        <w:rPr>
-          <w:lang w:val="en-US"/>
-        </w:rPr>
-        <w:t>getfinalpathname_nonstrict</w:t>
-      </w:r>
-      <w:proofErr w:type="spellEnd"/>
-    </w:p>
-    <w:p>
-      <w:proofErr w:type="spellStart"/>
-      <w:r>
-        <w:t>OSError</w:t>
-      </w:r>
-      <w:proofErr w:type="spellEnd"/>
-      <w:r>
-        <w:t>: [</w:t>
-      </w:r>
-      <w:proofErr w:type="spellStart"/>
-      <w:r>
-        <w:t>WinError</w:t>
-      </w:r>
-      <w:proofErr w:type="spellEnd"/>
-      <w:r>
-        <w:t xml:space="preserve"> 1005] Файловая система тома не распознана.</w:t>
-      </w:r>
-    </w:p>
-    <w:p>
-      <w:r>
-        <w:t>Убедитесь, что все требуемые системные драйверы загружены и том не поврежден: 'O:\\Домашние задания\\Курсовой проект 01\\</w:t>
-      </w:r>
-      <w:proofErr w:type="spellStart"/>
-      <w:r>
-        <w:t>RentEase</w:t>
-      </w:r>
-      <w:proofErr w:type="spellEnd"/>
-      <w:r>
-        <w:t>\\</w:t>
-      </w:r>
-      <w:proofErr w:type="spellStart"/>
-      <w:r>
-        <w:t>static</w:t>
-      </w:r>
-      <w:proofErr w:type="spellEnd"/>
-      <w:r>
-        <w:t>'</w:t>
+        <w:t xml:space="preserve">  File "&lt;frozen ntpath&gt;", line 736, in realpath</w:t>
+      </w:r>
+    </w:p>
+    <w:p>
+      <w:pPr>
+        <w:rPr>
+          <w:lang w:val="en-US"/>
+        </w:rPr>
+      </w:pPr>
+      <w:r>
+        <w:rPr>
+          <w:lang w:val="en-US"/>
+        </w:rPr>
+        <w:t xml:space="preserve">  File "&lt;frozen ntpath&gt;", line 676, in _getfinalpathname_nonstrict</w:t>
+      </w:r>
+    </w:p>
+    <w:p>
+      <w:r>
+        <w:t>OSError: [WinError 1005] Файловая система тома не распознана.</w:t>
+      </w:r>
+    </w:p>
+    <w:p>
+      <w:r>
+        <w:t>Убедитесь, что все требуемые системные драйверы загружены и том не поврежден: 'O:\\Домашние задания\\Курсовой проект 01\\RentEase\\static'</w:t>
       </w:r>
     </w:p>
     <w:p/>
@@ -391,7 +216,6 @@
         </w:rPr>
         <w:t xml:space="preserve">import </w:t>
       </w:r>
-      <w:proofErr w:type="spellStart"/>
       <w:r>
         <w:rPr>
           <w:rFonts w:ascii="Courier New" w:eastAsia="Times New Roman" w:hAnsi="Courier New" w:cs="Courier New"/>
@@ -402,7 +226,6 @@
         </w:rPr>
         <w:t>os</w:t>
       </w:r>
-      <w:proofErr w:type="spellEnd"/>
       <w:r>
         <w:rPr>
           <w:rFonts w:ascii="Courier New" w:eastAsia="Times New Roman" w:hAnsi="Courier New" w:cs="Courier New"/>
@@ -602,9 +425,18 @@
           <w:lang w:val="en-US" w:eastAsia="ru-RU"/>
         </w:rPr>
         <w:br/>
-        <w:t xml:space="preserve">app = </w:t>
-      </w:r>
-      <w:proofErr w:type="spellStart"/>
+        <w:t>app = FastAPI(</w:t>
+      </w:r>
+      <w:r>
+        <w:rPr>
+          <w:rFonts w:ascii="Courier New" w:eastAsia="Times New Roman" w:hAnsi="Courier New" w:cs="Courier New"/>
+          <w:color w:val="AA4926"/>
+          <w:sz w:val="20"/>
+          <w:szCs w:val="20"/>
+          <w:lang w:val="en-US" w:eastAsia="ru-RU"/>
+        </w:rPr>
+        <w:t>title</w:t>
+      </w:r>
       <w:r>
         <w:rPr>
           <w:rFonts w:ascii="Courier New" w:eastAsia="Times New Roman" w:hAnsi="Courier New" w:cs="Courier New"/>
@@ -613,9 +445,18 @@
           <w:szCs w:val="20"/>
           <w:lang w:val="en-US" w:eastAsia="ru-RU"/>
         </w:rPr>
-        <w:t>FastAPI</w:t>
-      </w:r>
-      <w:proofErr w:type="spellEnd"/>
+        <w:t>=</w:t>
+      </w:r>
+      <w:r>
+        <w:rPr>
+          <w:rFonts w:ascii="Courier New" w:eastAsia="Times New Roman" w:hAnsi="Courier New" w:cs="Courier New"/>
+          <w:color w:val="6AAB73"/>
+          <w:sz w:val="20"/>
+          <w:szCs w:val="20"/>
+          <w:lang w:val="en-US" w:eastAsia="ru-RU"/>
+        </w:rPr>
+        <w:t>"RentEase"</w:t>
+      </w:r>
       <w:r>
         <w:rPr>
           <w:rFonts w:ascii="Courier New" w:eastAsia="Times New Roman" w:hAnsi="Courier New" w:cs="Courier New"/>
@@ -624,7 +465,7 @@
           <w:szCs w:val="20"/>
           <w:lang w:val="en-US" w:eastAsia="ru-RU"/>
         </w:rPr>
-        <w:t>(</w:t>
+        <w:t xml:space="preserve">, </w:t>
       </w:r>
       <w:r>
         <w:rPr>
@@ -634,7 +475,7 @@
           <w:szCs w:val="20"/>
           <w:lang w:val="en-US" w:eastAsia="ru-RU"/>
         </w:rPr>
-        <w:t>title</w:t>
+        <w:t>version</w:t>
       </w:r>
       <w:r>
         <w:rPr>
@@ -654,9 +495,118 @@
           <w:szCs w:val="20"/>
           <w:lang w:val="en-US" w:eastAsia="ru-RU"/>
         </w:rPr>
-        <w:t>"</w:t>
-      </w:r>
-      <w:proofErr w:type="spellStart"/>
+        <w:t>"2.0"</w:t>
+      </w:r>
+      <w:r>
+        <w:rPr>
+          <w:rFonts w:ascii="Courier New" w:eastAsia="Times New Roman" w:hAnsi="Courier New" w:cs="Courier New"/>
+          <w:color w:val="BCBEC4"/>
+          <w:sz w:val="20"/>
+          <w:szCs w:val="20"/>
+          <w:lang w:val="en-US" w:eastAsia="ru-RU"/>
+        </w:rPr>
+        <w:t>)</w:t>
+      </w:r>
+      <w:r>
+        <w:rPr>
+          <w:rFonts w:ascii="Courier New" w:eastAsia="Times New Roman" w:hAnsi="Courier New" w:cs="Courier New"/>
+          <w:color w:val="BCBEC4"/>
+          <w:sz w:val="20"/>
+          <w:szCs w:val="20"/>
+          <w:lang w:val="en-US" w:eastAsia="ru-RU"/>
+        </w:rPr>
+        <w:br/>
+      </w:r>
+      <w:r>
+        <w:rPr>
+          <w:rFonts w:ascii="Courier New" w:eastAsia="Times New Roman" w:hAnsi="Courier New" w:cs="Courier New"/>
+          <w:color w:val="BCBEC4"/>
+          <w:sz w:val="20"/>
+          <w:szCs w:val="20"/>
+          <w:lang w:val="en-US" w:eastAsia="ru-RU"/>
+        </w:rPr>
+        <w:br/>
+      </w:r>
+      <w:r>
+        <w:rPr>
+          <w:rFonts w:ascii="Courier New" w:eastAsia="Times New Roman" w:hAnsi="Courier New" w:cs="Courier New"/>
+          <w:color w:val="7A7E85"/>
+          <w:sz w:val="20"/>
+          <w:szCs w:val="20"/>
+          <w:lang w:val="en-US" w:eastAsia="ru-RU"/>
+        </w:rPr>
+        <w:t xml:space="preserve"># </w:t>
+      </w:r>
+      <w:r>
+        <w:rPr>
+          <w:rFonts w:ascii="Courier New" w:eastAsia="Times New Roman" w:hAnsi="Courier New" w:cs="Courier New"/>
+          <w:color w:val="7A7E85"/>
+          <w:sz w:val="20"/>
+          <w:szCs w:val="20"/>
+          <w:lang w:eastAsia="ru-RU"/>
+        </w:rPr>
+        <w:t>Используем</w:t>
+      </w:r>
+      <w:r>
+        <w:rPr>
+          <w:rFonts w:ascii="Courier New" w:eastAsia="Times New Roman" w:hAnsi="Courier New" w:cs="Courier New"/>
+          <w:color w:val="7A7E85"/>
+          <w:sz w:val="20"/>
+          <w:szCs w:val="20"/>
+          <w:lang w:val="en-US" w:eastAsia="ru-RU"/>
+        </w:rPr>
+        <w:t xml:space="preserve"> </w:t>
+      </w:r>
+      <w:r>
+        <w:rPr>
+          <w:rFonts w:ascii="Courier New" w:eastAsia="Times New Roman" w:hAnsi="Courier New" w:cs="Courier New"/>
+          <w:color w:val="7A7E85"/>
+          <w:sz w:val="20"/>
+          <w:szCs w:val="20"/>
+          <w:lang w:eastAsia="ru-RU"/>
+        </w:rPr>
+        <w:t>абсолютные</w:t>
+      </w:r>
+      <w:r>
+        <w:rPr>
+          <w:rFonts w:ascii="Courier New" w:eastAsia="Times New Roman" w:hAnsi="Courier New" w:cs="Courier New"/>
+          <w:color w:val="7A7E85"/>
+          <w:sz w:val="20"/>
+          <w:szCs w:val="20"/>
+          <w:lang w:val="en-US" w:eastAsia="ru-RU"/>
+        </w:rPr>
+        <w:t xml:space="preserve"> </w:t>
+      </w:r>
+      <w:r>
+        <w:rPr>
+          <w:rFonts w:ascii="Courier New" w:eastAsia="Times New Roman" w:hAnsi="Courier New" w:cs="Courier New"/>
+          <w:color w:val="7A7E85"/>
+          <w:sz w:val="20"/>
+          <w:szCs w:val="20"/>
+          <w:lang w:eastAsia="ru-RU"/>
+        </w:rPr>
+        <w:t>пути</w:t>
+      </w:r>
+      <w:r>
+        <w:rPr>
+          <w:rFonts w:ascii="Courier New" w:eastAsia="Times New Roman" w:hAnsi="Courier New" w:cs="Courier New"/>
+          <w:color w:val="7A7E85"/>
+          <w:sz w:val="20"/>
+          <w:szCs w:val="20"/>
+          <w:lang w:val="en-US" w:eastAsia="ru-RU"/>
+        </w:rPr>
+        <w:br/>
+      </w:r>
+      <w:r>
+        <w:rPr>
+          <w:rFonts w:ascii="Courier New" w:eastAsia="Times New Roman" w:hAnsi="Courier New" w:cs="Courier New"/>
+          <w:color w:val="BCBEC4"/>
+          <w:sz w:val="20"/>
+          <w:szCs w:val="20"/>
+          <w:lang w:val="en-US" w:eastAsia="ru-RU"/>
+        </w:rPr>
+        <w:t xml:space="preserve">static_dir = BASE_DIR / </w:t>
+      </w:r>
       <w:r>
         <w:rPr>
           <w:rFonts w:ascii="Courier New" w:eastAsia="Times New Roman" w:hAnsi="Courier New" w:cs="Courier New"/>
@@ -665,9 +615,8 @@
           <w:szCs w:val="20"/>
           <w:lang w:val="en-US" w:eastAsia="ru-RU"/>
         </w:rPr>
-        <w:t>RentEase</w:t>
-      </w:r>
-      <w:proofErr w:type="spellEnd"/>
+        <w:t>"static"</w:t>
+      </w:r>
       <w:r>
         <w:rPr>
           <w:rFonts w:ascii="Courier New" w:eastAsia="Times New Roman" w:hAnsi="Courier New" w:cs="Courier New"/>
@@ -676,7 +625,7 @@
           <w:szCs w:val="20"/>
           <w:lang w:val="en-US" w:eastAsia="ru-RU"/>
         </w:rPr>
-        <w:t>"</w:t>
+        <w:br/>
       </w:r>
       <w:r>
         <w:rPr>
@@ -686,17 +635,147 @@
           <w:szCs w:val="20"/>
           <w:lang w:val="en-US" w:eastAsia="ru-RU"/>
         </w:rPr>
+        <w:t xml:space="preserve">templates_dir = BASE_DIR / </w:t>
+      </w:r>
+      <w:r>
+        <w:rPr>
+          <w:rFonts w:ascii="Courier New" w:eastAsia="Times New Roman" w:hAnsi="Courier New" w:cs="Courier New"/>
+          <w:color w:val="6AAB73"/>
+          <w:sz w:val="20"/>
+          <w:szCs w:val="20"/>
+          <w:lang w:val="en-US" w:eastAsia="ru-RU"/>
+        </w:rPr>
+        <w:t>"templates"</w:t>
+      </w:r>
+      <w:r>
+        <w:rPr>
+          <w:rFonts w:ascii="Courier New" w:eastAsia="Times New Roman" w:hAnsi="Courier New" w:cs="Courier New"/>
+          <w:color w:val="6AAB73"/>
+          <w:sz w:val="20"/>
+          <w:szCs w:val="20"/>
+          <w:lang w:val="en-US" w:eastAsia="ru-RU"/>
+        </w:rPr>
+        <w:br/>
+      </w:r>
+      <w:r>
+        <w:rPr>
+          <w:rFonts w:ascii="Courier New" w:eastAsia="Times New Roman" w:hAnsi="Courier New" w:cs="Courier New"/>
+          <w:color w:val="6AAB73"/>
+          <w:sz w:val="20"/>
+          <w:szCs w:val="20"/>
+          <w:lang w:val="en-US" w:eastAsia="ru-RU"/>
+        </w:rPr>
+        <w:br/>
+      </w:r>
+      <w:r>
+        <w:rPr>
+          <w:rFonts w:ascii="Courier New" w:eastAsia="Times New Roman" w:hAnsi="Courier New" w:cs="Courier New"/>
+          <w:color w:val="7A7E85"/>
+          <w:sz w:val="20"/>
+          <w:szCs w:val="20"/>
+          <w:lang w:val="en-US" w:eastAsia="ru-RU"/>
+        </w:rPr>
+        <w:t xml:space="preserve"># </w:t>
+      </w:r>
+      <w:r>
+        <w:rPr>
+          <w:rFonts w:ascii="Courier New" w:eastAsia="Times New Roman" w:hAnsi="Courier New" w:cs="Courier New"/>
+          <w:color w:val="7A7E85"/>
+          <w:sz w:val="20"/>
+          <w:szCs w:val="20"/>
+          <w:lang w:eastAsia="ru-RU"/>
+        </w:rPr>
+        <w:t>Убедимся</w:t>
+      </w:r>
+      <w:r>
+        <w:rPr>
+          <w:rFonts w:ascii="Courier New" w:eastAsia="Times New Roman" w:hAnsi="Courier New" w:cs="Courier New"/>
+          <w:color w:val="7A7E85"/>
+          <w:sz w:val="20"/>
+          <w:szCs w:val="20"/>
+          <w:lang w:val="en-US" w:eastAsia="ru-RU"/>
+        </w:rPr>
         <w:t xml:space="preserve">, </w:t>
       </w:r>
       <w:r>
         <w:rPr>
           <w:rFonts w:ascii="Courier New" w:eastAsia="Times New Roman" w:hAnsi="Courier New" w:cs="Courier New"/>
+          <w:color w:val="7A7E85"/>
+          <w:sz w:val="20"/>
+          <w:szCs w:val="20"/>
+          <w:lang w:eastAsia="ru-RU"/>
+        </w:rPr>
+        <w:t>что</w:t>
+      </w:r>
+      <w:r>
+        <w:rPr>
+          <w:rFonts w:ascii="Courier New" w:eastAsia="Times New Roman" w:hAnsi="Courier New" w:cs="Courier New"/>
+          <w:color w:val="7A7E85"/>
+          <w:sz w:val="20"/>
+          <w:szCs w:val="20"/>
+          <w:lang w:val="en-US" w:eastAsia="ru-RU"/>
+        </w:rPr>
+        <w:t xml:space="preserve"> </w:t>
+      </w:r>
+      <w:r>
+        <w:rPr>
+          <w:rFonts w:ascii="Courier New" w:eastAsia="Times New Roman" w:hAnsi="Courier New" w:cs="Courier New"/>
+          <w:color w:val="7A7E85"/>
+          <w:sz w:val="20"/>
+          <w:szCs w:val="20"/>
+          <w:lang w:eastAsia="ru-RU"/>
+        </w:rPr>
+        <w:t>папки</w:t>
+      </w:r>
+      <w:r>
+        <w:rPr>
+          <w:rFonts w:ascii="Courier New" w:eastAsia="Times New Roman" w:hAnsi="Courier New" w:cs="Courier New"/>
+          <w:color w:val="7A7E85"/>
+          <w:sz w:val="20"/>
+          <w:szCs w:val="20"/>
+          <w:lang w:val="en-US" w:eastAsia="ru-RU"/>
+        </w:rPr>
+        <w:t xml:space="preserve"> </w:t>
+      </w:r>
+      <w:r>
+        <w:rPr>
+          <w:rFonts w:ascii="Courier New" w:eastAsia="Times New Roman" w:hAnsi="Courier New" w:cs="Courier New"/>
+          <w:color w:val="7A7E85"/>
+          <w:sz w:val="20"/>
+          <w:szCs w:val="20"/>
+          <w:lang w:eastAsia="ru-RU"/>
+        </w:rPr>
+        <w:t>существуют</w:t>
+      </w:r>
+      <w:r>
+        <w:rPr>
+          <w:rFonts w:ascii="Courier New" w:eastAsia="Times New Roman" w:hAnsi="Courier New" w:cs="Courier New"/>
+          <w:color w:val="7A7E85"/>
+          <w:sz w:val="20"/>
+          <w:szCs w:val="20"/>
+          <w:lang w:val="en-US" w:eastAsia="ru-RU"/>
+        </w:rPr>
+        <w:br/>
+      </w:r>
+      <w:r>
+        <w:rPr>
+          <w:rFonts w:ascii="Courier New" w:eastAsia="Times New Roman" w:hAnsi="Courier New" w:cs="Courier New"/>
+          <w:color w:val="BCBEC4"/>
+          <w:sz w:val="20"/>
+          <w:szCs w:val="20"/>
+          <w:lang w:val="en-US" w:eastAsia="ru-RU"/>
+        </w:rPr>
+        <w:t>static_dir.mkdir(</w:t>
+      </w:r>
+      <w:r>
+        <w:rPr>
+          <w:rFonts w:ascii="Courier New" w:eastAsia="Times New Roman" w:hAnsi="Courier New" w:cs="Courier New"/>
           <w:color w:val="AA4926"/>
           <w:sz w:val="20"/>
           <w:szCs w:val="20"/>
           <w:lang w:val="en-US" w:eastAsia="ru-RU"/>
         </w:rPr>
-        <w:t>version</w:t>
+        <w:t>exist_ok</w:t>
       </w:r>
       <w:r>
         <w:rPr>
@@ -711,12 +790,104 @@
       <w:r>
         <w:rPr>
           <w:rFonts w:ascii="Courier New" w:eastAsia="Times New Roman" w:hAnsi="Courier New" w:cs="Courier New"/>
+          <w:color w:val="CF8E6D"/>
+          <w:sz w:val="20"/>
+          <w:szCs w:val="20"/>
+          <w:lang w:val="en-US" w:eastAsia="ru-RU"/>
+        </w:rPr>
+        <w:t>True</w:t>
+      </w:r>
+      <w:r>
+        <w:rPr>
+          <w:rFonts w:ascii="Courier New" w:eastAsia="Times New Roman" w:hAnsi="Courier New" w:cs="Courier New"/>
+          <w:color w:val="BCBEC4"/>
+          <w:sz w:val="20"/>
+          <w:szCs w:val="20"/>
+          <w:lang w:val="en-US" w:eastAsia="ru-RU"/>
+        </w:rPr>
+        <w:t>)</w:t>
+      </w:r>
+      <w:r>
+        <w:rPr>
+          <w:rFonts w:ascii="Courier New" w:eastAsia="Times New Roman" w:hAnsi="Courier New" w:cs="Courier New"/>
+          <w:color w:val="BCBEC4"/>
+          <w:sz w:val="20"/>
+          <w:szCs w:val="20"/>
+          <w:lang w:val="en-US" w:eastAsia="ru-RU"/>
+        </w:rPr>
+        <w:br/>
+        <w:t>templates_dir.mkdir(</w:t>
+      </w:r>
+      <w:r>
+        <w:rPr>
+          <w:rFonts w:ascii="Courier New" w:eastAsia="Times New Roman" w:hAnsi="Courier New" w:cs="Courier New"/>
+          <w:color w:val="AA4926"/>
+          <w:sz w:val="20"/>
+          <w:szCs w:val="20"/>
+          <w:lang w:val="en-US" w:eastAsia="ru-RU"/>
+        </w:rPr>
+        <w:t>exist_ok</w:t>
+      </w:r>
+      <w:r>
+        <w:rPr>
+          <w:rFonts w:ascii="Courier New" w:eastAsia="Times New Roman" w:hAnsi="Courier New" w:cs="Courier New"/>
+          <w:color w:val="BCBEC4"/>
+          <w:sz w:val="20"/>
+          <w:szCs w:val="20"/>
+          <w:lang w:val="en-US" w:eastAsia="ru-RU"/>
+        </w:rPr>
+        <w:t>=</w:t>
+      </w:r>
+      <w:r>
+        <w:rPr>
+          <w:rFonts w:ascii="Courier New" w:eastAsia="Times New Roman" w:hAnsi="Courier New" w:cs="Courier New"/>
+          <w:color w:val="CF8E6D"/>
+          <w:sz w:val="20"/>
+          <w:szCs w:val="20"/>
+          <w:lang w:val="en-US" w:eastAsia="ru-RU"/>
+        </w:rPr>
+        <w:t>True</w:t>
+      </w:r>
+      <w:r>
+        <w:rPr>
+          <w:rFonts w:ascii="Courier New" w:eastAsia="Times New Roman" w:hAnsi="Courier New" w:cs="Courier New"/>
+          <w:color w:val="BCBEC4"/>
+          <w:sz w:val="20"/>
+          <w:szCs w:val="20"/>
+          <w:lang w:val="en-US" w:eastAsia="ru-RU"/>
+        </w:rPr>
+        <w:t>)</w:t>
+      </w:r>
+      <w:r>
+        <w:rPr>
+          <w:rFonts w:ascii="Courier New" w:eastAsia="Times New Roman" w:hAnsi="Courier New" w:cs="Courier New"/>
+          <w:color w:val="BCBEC4"/>
+          <w:sz w:val="20"/>
+          <w:szCs w:val="20"/>
+          <w:lang w:val="en-US" w:eastAsia="ru-RU"/>
+        </w:rPr>
+        <w:br/>
+      </w:r>
+      <w:r>
+        <w:rPr>
+          <w:rFonts w:ascii="Courier New" w:eastAsia="Times New Roman" w:hAnsi="Courier New" w:cs="Courier New"/>
+          <w:color w:val="BCBEC4"/>
+          <w:sz w:val="20"/>
+          <w:szCs w:val="20"/>
+          <w:lang w:val="en-US" w:eastAsia="ru-RU"/>
+        </w:rPr>
+        <w:br/>
+        <w:t>app.mount(</w:t>
+      </w:r>
+      <w:r>
+        <w:rPr>
+          <w:rFonts w:ascii="Courier New" w:eastAsia="Times New Roman" w:hAnsi="Courier New" w:cs="Courier New"/>
           <w:color w:val="6AAB73"/>
           <w:sz w:val="20"/>
           <w:szCs w:val="20"/>
           <w:lang w:val="en-US" w:eastAsia="ru-RU"/>
         </w:rPr>
-        <w:t>"2.0"</w:t>
+        <w:t>"/static"</w:t>
       </w:r>
       <w:r>
         <w:rPr>
@@ -726,7 +897,17 @@
           <w:szCs w:val="20"/>
           <w:lang w:val="en-US" w:eastAsia="ru-RU"/>
         </w:rPr>
-        <w:t>)</w:t>
+        <w:t>, StaticFiles(</w:t>
+      </w:r>
+      <w:r>
+        <w:rPr>
+          <w:rFonts w:ascii="Courier New" w:eastAsia="Times New Roman" w:hAnsi="Courier New" w:cs="Courier New"/>
+          <w:color w:val="AA4926"/>
+          <w:sz w:val="20"/>
+          <w:szCs w:val="20"/>
+          <w:lang w:val="en-US" w:eastAsia="ru-RU"/>
+        </w:rPr>
+        <w:t>directory</w:t>
       </w:r>
       <w:r>
         <w:rPr>
@@ -736,7 +917,17 @@
           <w:szCs w:val="20"/>
           <w:lang w:val="en-US" w:eastAsia="ru-RU"/>
         </w:rPr>
-        <w:br/>
+        <w:t>=</w:t>
+      </w:r>
+      <w:r>
+        <w:rPr>
+          <w:rFonts w:ascii="Courier New" w:eastAsia="Times New Roman" w:hAnsi="Courier New" w:cs="Courier New"/>
+          <w:color w:val="8888C6"/>
+          <w:sz w:val="20"/>
+          <w:szCs w:val="20"/>
+          <w:lang w:val="en-US" w:eastAsia="ru-RU"/>
+        </w:rPr>
+        <w:t>str</w:t>
       </w:r>
       <w:r>
         <w:rPr>
@@ -746,545 +937,7 @@
           <w:szCs w:val="20"/>
           <w:lang w:val="en-US" w:eastAsia="ru-RU"/>
         </w:rPr>
-        <w:br/>
-      </w:r>
-      <w:r>
-        <w:rPr>
-          <w:rFonts w:ascii="Courier New" w:eastAsia="Times New Roman" w:hAnsi="Courier New" w:cs="Courier New"/>
-          <w:color w:val="7A7E85"/>
-          <w:sz w:val="20"/>
-          <w:szCs w:val="20"/>
-          <w:lang w:val="en-US" w:eastAsia="ru-RU"/>
-        </w:rPr>
-        <w:t xml:space="preserve"># </w:t>
-      </w:r>
-      <w:r>
-        <w:rPr>
-          <w:rFonts w:ascii="Courier New" w:eastAsia="Times New Roman" w:hAnsi="Courier New" w:cs="Courier New"/>
-          <w:color w:val="7A7E85"/>
-          <w:sz w:val="20"/>
-          <w:szCs w:val="20"/>
-          <w:lang w:eastAsia="ru-RU"/>
-        </w:rPr>
-        <w:t>Используем</w:t>
-      </w:r>
-      <w:r>
-        <w:rPr>
-          <w:rFonts w:ascii="Courier New" w:eastAsia="Times New Roman" w:hAnsi="Courier New" w:cs="Courier New"/>
-          <w:color w:val="7A7E85"/>
-          <w:sz w:val="20"/>
-          <w:szCs w:val="20"/>
-          <w:lang w:val="en-US" w:eastAsia="ru-RU"/>
-        </w:rPr>
-        <w:t xml:space="preserve"> </w:t>
-      </w:r>
-      <w:r>
-        <w:rPr>
-          <w:rFonts w:ascii="Courier New" w:eastAsia="Times New Roman" w:hAnsi="Courier New" w:cs="Courier New"/>
-          <w:color w:val="7A7E85"/>
-          <w:sz w:val="20"/>
-          <w:szCs w:val="20"/>
-          <w:lang w:eastAsia="ru-RU"/>
-        </w:rPr>
-        <w:t>абсолютные</w:t>
-      </w:r>
-      <w:r>
-        <w:rPr>
-          <w:rFonts w:ascii="Courier New" w:eastAsia="Times New Roman" w:hAnsi="Courier New" w:cs="Courier New"/>
-          <w:color w:val="7A7E85"/>
-          <w:sz w:val="20"/>
-          <w:szCs w:val="20"/>
-          <w:lang w:val="en-US" w:eastAsia="ru-RU"/>
-        </w:rPr>
-        <w:t xml:space="preserve"> </w:t>
-      </w:r>
-      <w:r>
-        <w:rPr>
-          <w:rFonts w:ascii="Courier New" w:eastAsia="Times New Roman" w:hAnsi="Courier New" w:cs="Courier New"/>
-          <w:color w:val="7A7E85"/>
-          <w:sz w:val="20"/>
-          <w:szCs w:val="20"/>
-          <w:lang w:eastAsia="ru-RU"/>
-        </w:rPr>
-        <w:t>пути</w:t>
-      </w:r>
-      <w:r>
-        <w:rPr>
-          <w:rFonts w:ascii="Courier New" w:eastAsia="Times New Roman" w:hAnsi="Courier New" w:cs="Courier New"/>
-          <w:color w:val="7A7E85"/>
-          <w:sz w:val="20"/>
-          <w:szCs w:val="20"/>
-          <w:lang w:val="en-US" w:eastAsia="ru-RU"/>
-        </w:rPr>
-        <w:br/>
-      </w:r>
-      <w:proofErr w:type="spellStart"/>
-      <w:r>
-        <w:rPr>
-          <w:rFonts w:ascii="Courier New" w:eastAsia="Times New Roman" w:hAnsi="Courier New" w:cs="Courier New"/>
-          <w:color w:val="BCBEC4"/>
-          <w:sz w:val="20"/>
-          <w:szCs w:val="20"/>
-          <w:lang w:val="en-US" w:eastAsia="ru-RU"/>
-        </w:rPr>
-        <w:t>static_dir</w:t>
-      </w:r>
-      <w:proofErr w:type="spellEnd"/>
-      <w:r>
-        <w:rPr>
-          <w:rFonts w:ascii="Courier New" w:eastAsia="Times New Roman" w:hAnsi="Courier New" w:cs="Courier New"/>
-          <w:color w:val="BCBEC4"/>
-          <w:sz w:val="20"/>
-          <w:szCs w:val="20"/>
-          <w:lang w:val="en-US" w:eastAsia="ru-RU"/>
-        </w:rPr>
-        <w:t xml:space="preserve"> = BASE_DIR / </w:t>
-      </w:r>
-      <w:r>
-        <w:rPr>
-          <w:rFonts w:ascii="Courier New" w:eastAsia="Times New Roman" w:hAnsi="Courier New" w:cs="Courier New"/>
-          <w:color w:val="6AAB73"/>
-          <w:sz w:val="20"/>
-          <w:szCs w:val="20"/>
-          <w:lang w:val="en-US" w:eastAsia="ru-RU"/>
-        </w:rPr>
-        <w:t>"static"</w:t>
-      </w:r>
-      <w:r>
-        <w:rPr>
-          <w:rFonts w:ascii="Courier New" w:eastAsia="Times New Roman" w:hAnsi="Courier New" w:cs="Courier New"/>
-          <w:color w:val="6AAB73"/>
-          <w:sz w:val="20"/>
-          <w:szCs w:val="20"/>
-          <w:lang w:val="en-US" w:eastAsia="ru-RU"/>
-        </w:rPr>
-        <w:br/>
-      </w:r>
-      <w:proofErr w:type="spellStart"/>
-      <w:r>
-        <w:rPr>
-          <w:rFonts w:ascii="Courier New" w:eastAsia="Times New Roman" w:hAnsi="Courier New" w:cs="Courier New"/>
-          <w:color w:val="BCBEC4"/>
-          <w:sz w:val="20"/>
-          <w:szCs w:val="20"/>
-          <w:lang w:val="en-US" w:eastAsia="ru-RU"/>
-        </w:rPr>
-        <w:t>templates_dir</w:t>
-      </w:r>
-      <w:proofErr w:type="spellEnd"/>
-      <w:r>
-        <w:rPr>
-          <w:rFonts w:ascii="Courier New" w:eastAsia="Times New Roman" w:hAnsi="Courier New" w:cs="Courier New"/>
-          <w:color w:val="BCBEC4"/>
-          <w:sz w:val="20"/>
-          <w:szCs w:val="20"/>
-          <w:lang w:val="en-US" w:eastAsia="ru-RU"/>
-        </w:rPr>
-        <w:t xml:space="preserve"> = BASE_DIR / </w:t>
-      </w:r>
-      <w:r>
-        <w:rPr>
-          <w:rFonts w:ascii="Courier New" w:eastAsia="Times New Roman" w:hAnsi="Courier New" w:cs="Courier New"/>
-          <w:color w:val="6AAB73"/>
-          <w:sz w:val="20"/>
-          <w:szCs w:val="20"/>
-          <w:lang w:val="en-US" w:eastAsia="ru-RU"/>
-        </w:rPr>
-        <w:t>"templates"</w:t>
-      </w:r>
-      <w:r>
-        <w:rPr>
-          <w:rFonts w:ascii="Courier New" w:eastAsia="Times New Roman" w:hAnsi="Courier New" w:cs="Courier New"/>
-          <w:color w:val="6AAB73"/>
-          <w:sz w:val="20"/>
-          <w:szCs w:val="20"/>
-          <w:lang w:val="en-US" w:eastAsia="ru-RU"/>
-        </w:rPr>
-        <w:br/>
-      </w:r>
-      <w:r>
-        <w:rPr>
-          <w:rFonts w:ascii="Courier New" w:eastAsia="Times New Roman" w:hAnsi="Courier New" w:cs="Courier New"/>
-          <w:color w:val="6AAB73"/>
-          <w:sz w:val="20"/>
-          <w:szCs w:val="20"/>
-          <w:lang w:val="en-US" w:eastAsia="ru-RU"/>
-        </w:rPr>
-        <w:br/>
-      </w:r>
-      <w:r>
-        <w:rPr>
-          <w:rFonts w:ascii="Courier New" w:eastAsia="Times New Roman" w:hAnsi="Courier New" w:cs="Courier New"/>
-          <w:color w:val="7A7E85"/>
-          <w:sz w:val="20"/>
-          <w:szCs w:val="20"/>
-          <w:lang w:val="en-US" w:eastAsia="ru-RU"/>
-        </w:rPr>
-        <w:t xml:space="preserve"># </w:t>
-      </w:r>
-      <w:r>
-        <w:rPr>
-          <w:rFonts w:ascii="Courier New" w:eastAsia="Times New Roman" w:hAnsi="Courier New" w:cs="Courier New"/>
-          <w:color w:val="7A7E85"/>
-          <w:sz w:val="20"/>
-          <w:szCs w:val="20"/>
-          <w:lang w:eastAsia="ru-RU"/>
-        </w:rPr>
-        <w:t>Убедимся</w:t>
-      </w:r>
-      <w:r>
-        <w:rPr>
-          <w:rFonts w:ascii="Courier New" w:eastAsia="Times New Roman" w:hAnsi="Courier New" w:cs="Courier New"/>
-          <w:color w:val="7A7E85"/>
-          <w:sz w:val="20"/>
-          <w:szCs w:val="20"/>
-          <w:lang w:val="en-US" w:eastAsia="ru-RU"/>
-        </w:rPr>
-        <w:t xml:space="preserve">, </w:t>
-      </w:r>
-      <w:r>
-        <w:rPr>
-          <w:rFonts w:ascii="Courier New" w:eastAsia="Times New Roman" w:hAnsi="Courier New" w:cs="Courier New"/>
-          <w:color w:val="7A7E85"/>
-          <w:sz w:val="20"/>
-          <w:szCs w:val="20"/>
-          <w:lang w:eastAsia="ru-RU"/>
-        </w:rPr>
-        <w:t>что</w:t>
-      </w:r>
-      <w:r>
-        <w:rPr>
-          <w:rFonts w:ascii="Courier New" w:eastAsia="Times New Roman" w:hAnsi="Courier New" w:cs="Courier New"/>
-          <w:color w:val="7A7E85"/>
-          <w:sz w:val="20"/>
-          <w:szCs w:val="20"/>
-          <w:lang w:val="en-US" w:eastAsia="ru-RU"/>
-        </w:rPr>
-        <w:t xml:space="preserve"> </w:t>
-      </w:r>
-      <w:r>
-        <w:rPr>
-          <w:rFonts w:ascii="Courier New" w:eastAsia="Times New Roman" w:hAnsi="Courier New" w:cs="Courier New"/>
-          <w:color w:val="7A7E85"/>
-          <w:sz w:val="20"/>
-          <w:szCs w:val="20"/>
-          <w:lang w:eastAsia="ru-RU"/>
-        </w:rPr>
-        <w:t>папки</w:t>
-      </w:r>
-      <w:r>
-        <w:rPr>
-          <w:rFonts w:ascii="Courier New" w:eastAsia="Times New Roman" w:hAnsi="Courier New" w:cs="Courier New"/>
-          <w:color w:val="7A7E85"/>
-          <w:sz w:val="20"/>
-          <w:szCs w:val="20"/>
-          <w:lang w:val="en-US" w:eastAsia="ru-RU"/>
-        </w:rPr>
-        <w:t xml:space="preserve"> </w:t>
-      </w:r>
-      <w:r>
-        <w:rPr>
-          <w:rFonts w:ascii="Courier New" w:eastAsia="Times New Roman" w:hAnsi="Courier New" w:cs="Courier New"/>
-          <w:color w:val="7A7E85"/>
-          <w:sz w:val="20"/>
-          <w:szCs w:val="20"/>
-          <w:lang w:eastAsia="ru-RU"/>
-        </w:rPr>
-        <w:t>существуют</w:t>
-      </w:r>
-      <w:r>
-        <w:rPr>
-          <w:rFonts w:ascii="Courier New" w:eastAsia="Times New Roman" w:hAnsi="Courier New" w:cs="Courier New"/>
-          <w:color w:val="7A7E85"/>
-          <w:sz w:val="20"/>
-          <w:szCs w:val="20"/>
-          <w:lang w:val="en-US" w:eastAsia="ru-RU"/>
-        </w:rPr>
-        <w:br/>
-      </w:r>
-      <w:proofErr w:type="spellStart"/>
-      <w:r>
-        <w:rPr>
-          <w:rFonts w:ascii="Courier New" w:eastAsia="Times New Roman" w:hAnsi="Courier New" w:cs="Courier New"/>
-          <w:color w:val="BCBEC4"/>
-          <w:sz w:val="20"/>
-          <w:szCs w:val="20"/>
-          <w:lang w:val="en-US" w:eastAsia="ru-RU"/>
-        </w:rPr>
-        <w:t>static_dir.mkdir</w:t>
-      </w:r>
-      <w:proofErr w:type="spellEnd"/>
-      <w:r>
-        <w:rPr>
-          <w:rFonts w:ascii="Courier New" w:eastAsia="Times New Roman" w:hAnsi="Courier New" w:cs="Courier New"/>
-          <w:color w:val="BCBEC4"/>
-          <w:sz w:val="20"/>
-          <w:szCs w:val="20"/>
-          <w:lang w:val="en-US" w:eastAsia="ru-RU"/>
-        </w:rPr>
-        <w:t>(</w:t>
-      </w:r>
-      <w:proofErr w:type="spellStart"/>
-      <w:r>
-        <w:rPr>
-          <w:rFonts w:ascii="Courier New" w:eastAsia="Times New Roman" w:hAnsi="Courier New" w:cs="Courier New"/>
-          <w:color w:val="AA4926"/>
-          <w:sz w:val="20"/>
-          <w:szCs w:val="20"/>
-          <w:lang w:val="en-US" w:eastAsia="ru-RU"/>
-        </w:rPr>
-        <w:t>exist_ok</w:t>
-      </w:r>
-      <w:proofErr w:type="spellEnd"/>
-      <w:r>
-        <w:rPr>
-          <w:rFonts w:ascii="Courier New" w:eastAsia="Times New Roman" w:hAnsi="Courier New" w:cs="Courier New"/>
-          <w:color w:val="BCBEC4"/>
-          <w:sz w:val="20"/>
-          <w:szCs w:val="20"/>
-          <w:lang w:val="en-US" w:eastAsia="ru-RU"/>
-        </w:rPr>
-        <w:t>=</w:t>
-      </w:r>
-      <w:r>
-        <w:rPr>
-          <w:rFonts w:ascii="Courier New" w:eastAsia="Times New Roman" w:hAnsi="Courier New" w:cs="Courier New"/>
-          <w:color w:val="CF8E6D"/>
-          <w:sz w:val="20"/>
-          <w:szCs w:val="20"/>
-          <w:lang w:val="en-US" w:eastAsia="ru-RU"/>
-        </w:rPr>
-        <w:t>True</w:t>
-      </w:r>
-      <w:r>
-        <w:rPr>
-          <w:rFonts w:ascii="Courier New" w:eastAsia="Times New Roman" w:hAnsi="Courier New" w:cs="Courier New"/>
-          <w:color w:val="BCBEC4"/>
-          <w:sz w:val="20"/>
-          <w:szCs w:val="20"/>
-          <w:lang w:val="en-US" w:eastAsia="ru-RU"/>
-        </w:rPr>
-        <w:t>)</w:t>
-      </w:r>
-      <w:r>
-        <w:rPr>
-          <w:rFonts w:ascii="Courier New" w:eastAsia="Times New Roman" w:hAnsi="Courier New" w:cs="Courier New"/>
-          <w:color w:val="BCBEC4"/>
-          <w:sz w:val="20"/>
-          <w:szCs w:val="20"/>
-          <w:lang w:val="en-US" w:eastAsia="ru-RU"/>
-        </w:rPr>
-        <w:br/>
-      </w:r>
-      <w:proofErr w:type="spellStart"/>
-      <w:r>
-        <w:rPr>
-          <w:rFonts w:ascii="Courier New" w:eastAsia="Times New Roman" w:hAnsi="Courier New" w:cs="Courier New"/>
-          <w:color w:val="BCBEC4"/>
-          <w:sz w:val="20"/>
-          <w:szCs w:val="20"/>
-          <w:lang w:val="en-US" w:eastAsia="ru-RU"/>
-        </w:rPr>
-        <w:t>templates_dir.mkdir</w:t>
-      </w:r>
-      <w:proofErr w:type="spellEnd"/>
-      <w:r>
-        <w:rPr>
-          <w:rFonts w:ascii="Courier New" w:eastAsia="Times New Roman" w:hAnsi="Courier New" w:cs="Courier New"/>
-          <w:color w:val="BCBEC4"/>
-          <w:sz w:val="20"/>
-          <w:szCs w:val="20"/>
-          <w:lang w:val="en-US" w:eastAsia="ru-RU"/>
-        </w:rPr>
-        <w:t>(</w:t>
-      </w:r>
-      <w:proofErr w:type="spellStart"/>
-      <w:r>
-        <w:rPr>
-          <w:rFonts w:ascii="Courier New" w:eastAsia="Times New Roman" w:hAnsi="Courier New" w:cs="Courier New"/>
-          <w:color w:val="AA4926"/>
-          <w:sz w:val="20"/>
-          <w:szCs w:val="20"/>
-          <w:lang w:val="en-US" w:eastAsia="ru-RU"/>
-        </w:rPr>
-        <w:t>exist_ok</w:t>
-      </w:r>
-      <w:proofErr w:type="spellEnd"/>
-      <w:r>
-        <w:rPr>
-          <w:rFonts w:ascii="Courier New" w:eastAsia="Times New Roman" w:hAnsi="Courier New" w:cs="Courier New"/>
-          <w:color w:val="BCBEC4"/>
-          <w:sz w:val="20"/>
-          <w:szCs w:val="20"/>
-          <w:lang w:val="en-US" w:eastAsia="ru-RU"/>
-        </w:rPr>
-        <w:t>=</w:t>
-      </w:r>
-      <w:r>
-        <w:rPr>
-          <w:rFonts w:ascii="Courier New" w:eastAsia="Times New Roman" w:hAnsi="Courier New" w:cs="Courier New"/>
-          <w:color w:val="CF8E6D"/>
-          <w:sz w:val="20"/>
-          <w:szCs w:val="20"/>
-          <w:lang w:val="en-US" w:eastAsia="ru-RU"/>
-        </w:rPr>
-        <w:t>True</w:t>
-      </w:r>
-      <w:r>
-        <w:rPr>
-          <w:rFonts w:ascii="Courier New" w:eastAsia="Times New Roman" w:hAnsi="Courier New" w:cs="Courier New"/>
-          <w:color w:val="BCBEC4"/>
-          <w:sz w:val="20"/>
-          <w:szCs w:val="20"/>
-          <w:lang w:val="en-US" w:eastAsia="ru-RU"/>
-        </w:rPr>
-        <w:t>)</w:t>
-      </w:r>
-      <w:r>
-        <w:rPr>
-          <w:rFonts w:ascii="Courier New" w:eastAsia="Times New Roman" w:hAnsi="Courier New" w:cs="Courier New"/>
-          <w:color w:val="BCBEC4"/>
-          <w:sz w:val="20"/>
-          <w:szCs w:val="20"/>
-          <w:lang w:val="en-US" w:eastAsia="ru-RU"/>
-        </w:rPr>
-        <w:br/>
-      </w:r>
-      <w:r>
-        <w:rPr>
-          <w:rFonts w:ascii="Courier New" w:eastAsia="Times New Roman" w:hAnsi="Courier New" w:cs="Courier New"/>
-          <w:color w:val="BCBEC4"/>
-          <w:sz w:val="20"/>
-          <w:szCs w:val="20"/>
-          <w:lang w:val="en-US" w:eastAsia="ru-RU"/>
-        </w:rPr>
-        <w:br/>
-      </w:r>
-      <w:proofErr w:type="spellStart"/>
-      <w:r>
-        <w:rPr>
-          <w:rFonts w:ascii="Courier New" w:eastAsia="Times New Roman" w:hAnsi="Courier New" w:cs="Courier New"/>
-          <w:color w:val="BCBEC4"/>
-          <w:sz w:val="20"/>
-          <w:szCs w:val="20"/>
-          <w:lang w:val="en-US" w:eastAsia="ru-RU"/>
-        </w:rPr>
-        <w:t>app.mount</w:t>
-      </w:r>
-      <w:proofErr w:type="spellEnd"/>
-      <w:r>
-        <w:rPr>
-          <w:rFonts w:ascii="Courier New" w:eastAsia="Times New Roman" w:hAnsi="Courier New" w:cs="Courier New"/>
-          <w:color w:val="BCBEC4"/>
-          <w:sz w:val="20"/>
-          <w:szCs w:val="20"/>
-          <w:lang w:val="en-US" w:eastAsia="ru-RU"/>
-        </w:rPr>
-        <w:t>(</w:t>
-      </w:r>
-      <w:r>
-        <w:rPr>
-          <w:rFonts w:ascii="Courier New" w:eastAsia="Times New Roman" w:hAnsi="Courier New" w:cs="Courier New"/>
-          <w:color w:val="6AAB73"/>
-          <w:sz w:val="20"/>
-          <w:szCs w:val="20"/>
-          <w:lang w:val="en-US" w:eastAsia="ru-RU"/>
-        </w:rPr>
-        <w:t>"/static"</w:t>
-      </w:r>
-      <w:r>
-        <w:rPr>
-          <w:rFonts w:ascii="Courier New" w:eastAsia="Times New Roman" w:hAnsi="Courier New" w:cs="Courier New"/>
-          <w:color w:val="BCBEC4"/>
-          <w:sz w:val="20"/>
-          <w:szCs w:val="20"/>
-          <w:lang w:val="en-US" w:eastAsia="ru-RU"/>
-        </w:rPr>
-        <w:t xml:space="preserve">, </w:t>
-      </w:r>
-      <w:proofErr w:type="spellStart"/>
-      <w:r>
-        <w:rPr>
-          <w:rFonts w:ascii="Courier New" w:eastAsia="Times New Roman" w:hAnsi="Courier New" w:cs="Courier New"/>
-          <w:color w:val="BCBEC4"/>
-          <w:sz w:val="20"/>
-          <w:szCs w:val="20"/>
-          <w:lang w:val="en-US" w:eastAsia="ru-RU"/>
-        </w:rPr>
-        <w:t>StaticFiles</w:t>
-      </w:r>
-      <w:proofErr w:type="spellEnd"/>
-      <w:r>
-        <w:rPr>
-          <w:rFonts w:ascii="Courier New" w:eastAsia="Times New Roman" w:hAnsi="Courier New" w:cs="Courier New"/>
-          <w:color w:val="BCBEC4"/>
-          <w:sz w:val="20"/>
-          <w:szCs w:val="20"/>
-          <w:lang w:val="en-US" w:eastAsia="ru-RU"/>
-        </w:rPr>
-        <w:t>(</w:t>
-      </w:r>
-      <w:r>
-        <w:rPr>
-          <w:rFonts w:ascii="Courier New" w:eastAsia="Times New Roman" w:hAnsi="Courier New" w:cs="Courier New"/>
-          <w:color w:val="AA4926"/>
-          <w:sz w:val="20"/>
-          <w:szCs w:val="20"/>
-          <w:lang w:val="en-US" w:eastAsia="ru-RU"/>
-        </w:rPr>
-        <w:t>directory</w:t>
-      </w:r>
-      <w:r>
-        <w:rPr>
-          <w:rFonts w:ascii="Courier New" w:eastAsia="Times New Roman" w:hAnsi="Courier New" w:cs="Courier New"/>
-          <w:color w:val="BCBEC4"/>
-          <w:sz w:val="20"/>
-          <w:szCs w:val="20"/>
-          <w:lang w:val="en-US" w:eastAsia="ru-RU"/>
-        </w:rPr>
-        <w:t>=</w:t>
-      </w:r>
-      <w:r>
-        <w:rPr>
-          <w:rFonts w:ascii="Courier New" w:eastAsia="Times New Roman" w:hAnsi="Courier New" w:cs="Courier New"/>
-          <w:color w:val="8888C6"/>
-          <w:sz w:val="20"/>
-          <w:szCs w:val="20"/>
-          <w:lang w:val="en-US" w:eastAsia="ru-RU"/>
-        </w:rPr>
-        <w:t>str</w:t>
-      </w:r>
-      <w:r>
-        <w:rPr>
-          <w:rFonts w:ascii="Courier New" w:eastAsia="Times New Roman" w:hAnsi="Courier New" w:cs="Courier New"/>
-          <w:color w:val="BCBEC4"/>
-          <w:sz w:val="20"/>
-          <w:szCs w:val="20"/>
-          <w:lang w:val="en-US" w:eastAsia="ru-RU"/>
-        </w:rPr>
-        <w:t>(</w:t>
-      </w:r>
-      <w:proofErr w:type="spellStart"/>
-      <w:r>
-        <w:rPr>
-          <w:rFonts w:ascii="Courier New" w:eastAsia="Times New Roman" w:hAnsi="Courier New" w:cs="Courier New"/>
-          <w:color w:val="BCBEC4"/>
-          <w:sz w:val="20"/>
-          <w:szCs w:val="20"/>
-          <w:lang w:val="en-US" w:eastAsia="ru-RU"/>
-        </w:rPr>
-        <w:t>static_dir</w:t>
-      </w:r>
-      <w:proofErr w:type="spellEnd"/>
-      <w:r>
-        <w:rPr>
-          <w:rFonts w:ascii="Courier New" w:eastAsia="Times New Roman" w:hAnsi="Courier New" w:cs="Courier New"/>
-          <w:color w:val="BCBEC4"/>
-          <w:sz w:val="20"/>
-          <w:szCs w:val="20"/>
-          <w:lang w:val="en-US" w:eastAsia="ru-RU"/>
-        </w:rPr>
-        <w:t xml:space="preserve">)), </w:t>
+        <w:t xml:space="preserve">(static_dir)), </w:t>
       </w:r>
       <w:r>
         <w:rPr>
@@ -1375,29 +1028,7 @@
           <w:szCs w:val="20"/>
           <w:lang w:val="en-US" w:eastAsia="ru-RU"/>
         </w:rPr>
-        <w:t>(</w:t>
-      </w:r>
-      <w:proofErr w:type="spellStart"/>
-      <w:r>
-        <w:rPr>
-          <w:rFonts w:ascii="Courier New" w:eastAsia="Times New Roman" w:hAnsi="Courier New" w:cs="Courier New"/>
-          <w:color w:val="BCBEC4"/>
-          <w:sz w:val="20"/>
-          <w:szCs w:val="20"/>
-          <w:lang w:val="en-US" w:eastAsia="ru-RU"/>
-        </w:rPr>
-        <w:t>templates_dir</w:t>
-      </w:r>
-      <w:proofErr w:type="spellEnd"/>
-      <w:r>
-        <w:rPr>
-          <w:rFonts w:ascii="Courier New" w:eastAsia="Times New Roman" w:hAnsi="Courier New" w:cs="Courier New"/>
-          <w:color w:val="BCBEC4"/>
-          <w:sz w:val="20"/>
-          <w:szCs w:val="20"/>
-          <w:lang w:val="en-US" w:eastAsia="ru-RU"/>
-        </w:rPr>
-        <w:t>))</w:t>
+        <w:t>(templates_dir))</w:t>
       </w:r>
     </w:p>
     <w:p>
@@ -1542,224 +1173,98 @@
         <w:rPr>
           <w:lang w:val="en-US"/>
         </w:rPr>
-        <w:t xml:space="preserve"> </w:t>
-      </w:r>
-      <w:proofErr w:type="gramStart"/>
-      <w:r>
-        <w:rPr>
-          <w:lang w:val="en-US"/>
-        </w:rPr>
-        <w:t xml:space="preserve">INFO:   </w:t>
-      </w:r>
-      <w:proofErr w:type="gramEnd"/>
-      <w:r>
-        <w:rPr>
-          <w:lang w:val="en-US"/>
-        </w:rPr>
-        <w:t xml:space="preserve">  127.0.0.1:51462 - "GET /</w:t>
-      </w:r>
-      <w:proofErr w:type="spellStart"/>
-      <w:r>
-        <w:rPr>
-          <w:lang w:val="en-US"/>
-        </w:rPr>
-        <w:t>api</w:t>
-      </w:r>
-      <w:proofErr w:type="spellEnd"/>
-      <w:r>
-        <w:rPr>
-          <w:lang w:val="en-US"/>
-        </w:rPr>
-        <w:t>/my/applications HTTP/1.1" 200 OK</w:t>
-      </w:r>
-    </w:p>
-    <w:p>
-      <w:pPr>
-        <w:rPr>
-          <w:lang w:val="en-US"/>
-        </w:rPr>
-      </w:pPr>
-      <w:r>
-        <w:rPr>
-          <w:lang w:val="en-US"/>
-        </w:rPr>
-        <w:t>INFO:     127.0.0.1:51462 - "GET /</w:t>
-      </w:r>
-      <w:proofErr w:type="spellStart"/>
-      <w:r>
-        <w:rPr>
-          <w:lang w:val="en-US"/>
-        </w:rPr>
-        <w:t>api</w:t>
-      </w:r>
-      <w:proofErr w:type="spellEnd"/>
-      <w:r>
-        <w:rPr>
-          <w:lang w:val="en-US"/>
-        </w:rPr>
-        <w:t>/property/1 HTTP/1.1" 200 OK</w:t>
-      </w:r>
-    </w:p>
-    <w:p>
-      <w:pPr>
-        <w:rPr>
-          <w:lang w:val="en-US"/>
-        </w:rPr>
-      </w:pPr>
-      <w:r>
-        <w:rPr>
-          <w:lang w:val="en-US"/>
-        </w:rPr>
-        <w:t>INFO:     127.0.0.1:51462 - "GET /</w:t>
-      </w:r>
-      <w:proofErr w:type="spellStart"/>
-      <w:r>
-        <w:rPr>
-          <w:lang w:val="en-US"/>
-        </w:rPr>
-        <w:t>api</w:t>
-      </w:r>
-      <w:proofErr w:type="spellEnd"/>
-      <w:r>
-        <w:rPr>
-          <w:lang w:val="en-US"/>
-        </w:rPr>
-        <w:t>/property/2 HTTP/1.1" 200 OK</w:t>
-      </w:r>
-    </w:p>
-    <w:p>
-      <w:pPr>
-        <w:rPr>
-          <w:lang w:val="en-US"/>
-        </w:rPr>
-      </w:pPr>
-      <w:r>
-        <w:rPr>
-          <w:lang w:val="en-US"/>
-        </w:rPr>
-        <w:t>INFO:     127.0.0.1:51462 - "GET /</w:t>
-      </w:r>
-      <w:proofErr w:type="spellStart"/>
-      <w:r>
-        <w:rPr>
-          <w:lang w:val="en-US"/>
-        </w:rPr>
-        <w:t>api</w:t>
-      </w:r>
-      <w:proofErr w:type="spellEnd"/>
-      <w:r>
-        <w:rPr>
-          <w:lang w:val="en-US"/>
-        </w:rPr>
-        <w:t>/property/1 HTTP/1.1" 200 OK</w:t>
-      </w:r>
-    </w:p>
-    <w:p>
-      <w:pPr>
-        <w:rPr>
-          <w:lang w:val="en-US"/>
-        </w:rPr>
-      </w:pPr>
-      <w:r>
-        <w:rPr>
-          <w:lang w:val="en-US"/>
-        </w:rPr>
-        <w:t>INFO:     127.0.0.1:51462 - "GET /</w:t>
-      </w:r>
-      <w:proofErr w:type="spellStart"/>
-      <w:r>
-        <w:rPr>
-          <w:lang w:val="en-US"/>
-        </w:rPr>
-        <w:t>api</w:t>
-      </w:r>
-      <w:proofErr w:type="spellEnd"/>
-      <w:r>
-        <w:rPr>
-          <w:lang w:val="en-US"/>
-        </w:rPr>
-        <w:t>/property/129 HTTP/1.1" 200 OK</w:t>
-      </w:r>
-    </w:p>
-    <w:p>
-      <w:pPr>
-        <w:rPr>
-          <w:lang w:val="en-US"/>
-        </w:rPr>
-      </w:pPr>
-      <w:r>
-        <w:rPr>
-          <w:lang w:val="en-US"/>
-        </w:rPr>
-        <w:t>INFO:     127.0.0.1:51462 - "GET /</w:t>
-      </w:r>
-      <w:proofErr w:type="spellStart"/>
-      <w:r>
-        <w:rPr>
-          <w:lang w:val="en-US"/>
-        </w:rPr>
-        <w:t>api</w:t>
-      </w:r>
-      <w:proofErr w:type="spellEnd"/>
-      <w:r>
-        <w:rPr>
-          <w:lang w:val="en-US"/>
-        </w:rPr>
-        <w:t>/property/2 HTTP/1.1" 200 OK</w:t>
-      </w:r>
-    </w:p>
-    <w:p>
-      <w:pPr>
-        <w:rPr>
-          <w:lang w:val="en-US"/>
-        </w:rPr>
-      </w:pPr>
-      <w:r>
-        <w:rPr>
-          <w:lang w:val="en-US"/>
-        </w:rPr>
-        <w:t>INFO:     127.0.0.1:51462 - "GET /</w:t>
-      </w:r>
-      <w:proofErr w:type="spellStart"/>
-      <w:r>
-        <w:rPr>
-          <w:lang w:val="en-US"/>
-        </w:rPr>
-        <w:t>api</w:t>
-      </w:r>
-      <w:proofErr w:type="spellEnd"/>
-      <w:r>
-        <w:rPr>
-          <w:lang w:val="en-US"/>
-        </w:rPr>
-        <w:t>/property/129 HTTP/1.1" 200 OK</w:t>
-      </w:r>
-    </w:p>
-    <w:p>
-      <w:pPr>
-        <w:rPr>
-          <w:lang w:val="en-US"/>
-        </w:rPr>
-      </w:pPr>
-      <w:r>
-        <w:rPr>
-          <w:lang w:val="en-US"/>
-        </w:rPr>
-        <w:t>INFO:     127.0.0.1:51462 - "GET /</w:t>
-      </w:r>
-      <w:proofErr w:type="spellStart"/>
-      <w:r>
-        <w:rPr>
-          <w:lang w:val="en-US"/>
-        </w:rPr>
-        <w:t>api</w:t>
-      </w:r>
-      <w:proofErr w:type="spellEnd"/>
-      <w:r>
-        <w:rPr>
-          <w:lang w:val="en-US"/>
-        </w:rPr>
-        <w:t>/property/1 HTTP/1.1" 200 OK</w:t>
+        <w:t xml:space="preserve"> INFO:     127.0.0.1:51462 - "GET /api/my/applications HTTP/1.1" 200 OK</w:t>
+      </w:r>
+    </w:p>
+    <w:p>
+      <w:pPr>
+        <w:rPr>
+          <w:lang w:val="en-US"/>
+        </w:rPr>
+      </w:pPr>
+      <w:r>
+        <w:rPr>
+          <w:lang w:val="en-US"/>
+        </w:rPr>
+        <w:t>INFO:     127.0.0.1:51462 - "GET /api/property/1 HTTP/1.1" 200 OK</w:t>
+      </w:r>
+    </w:p>
+    <w:p>
+      <w:pPr>
+        <w:rPr>
+          <w:lang w:val="en-US"/>
+        </w:rPr>
+      </w:pPr>
+      <w:r>
+        <w:rPr>
+          <w:lang w:val="en-US"/>
+        </w:rPr>
+        <w:t>INFO:     127.0.0.1:51462 - "GET /api/property/2 HTTP/1.1" 200 OK</w:t>
+      </w:r>
+    </w:p>
+    <w:p>
+      <w:pPr>
+        <w:rPr>
+          <w:lang w:val="en-US"/>
+        </w:rPr>
+      </w:pPr>
+      <w:r>
+        <w:rPr>
+          <w:lang w:val="en-US"/>
+        </w:rPr>
+        <w:t>INFO:     127.0.0.1:51462 - "GET /api/property/1 HTTP/1.1" 200 OK</w:t>
+      </w:r>
+    </w:p>
+    <w:p>
+      <w:pPr>
+        <w:rPr>
+          <w:lang w:val="en-US"/>
+        </w:rPr>
+      </w:pPr>
+      <w:r>
+        <w:rPr>
+          <w:lang w:val="en-US"/>
+        </w:rPr>
+        <w:t>INFO:     127.0.0.1:51462 - "GET /api/property/129 HTTP/1.1" 200 OK</w:t>
+      </w:r>
+    </w:p>
+    <w:p>
+      <w:pPr>
+        <w:rPr>
+          <w:lang w:val="en-US"/>
+        </w:rPr>
+      </w:pPr>
+      <w:r>
+        <w:rPr>
+          <w:lang w:val="en-US"/>
+        </w:rPr>
+        <w:t>INFO:     127.0.0.1:51462 - "GET /api/property/2 HTTP/1.1" 200 OK</w:t>
+      </w:r>
+    </w:p>
+    <w:p>
+      <w:pPr>
+        <w:rPr>
+          <w:lang w:val="en-US"/>
+        </w:rPr>
+      </w:pPr>
+      <w:r>
+        <w:rPr>
+          <w:lang w:val="en-US"/>
+        </w:rPr>
+        <w:t>INFO:     127.0.0.1:51462 - "GET /api/property/129 HTTP/1.1" 200 OK</w:t>
+      </w:r>
+    </w:p>
+    <w:p>
+      <w:pPr>
+        <w:rPr>
+          <w:lang w:val="en-US"/>
+        </w:rPr>
+      </w:pPr>
+      <w:r>
+        <w:rPr>
+          <w:lang w:val="en-US"/>
+        </w:rPr>
+        <w:t>INFO:     127.0.0.1:51462 - "GET /api/property/1 HTTP/1.1" 200 OK</w:t>
       </w:r>
     </w:p>
     <w:p>
@@ -1774,13 +1279,8 @@
       </w:r>
     </w:p>
     <w:p>
-      <w:proofErr w:type="gramStart"/>
-      <w:r>
-        <w:t xml:space="preserve">INFO:   </w:t>
-      </w:r>
-      <w:proofErr w:type="gramEnd"/>
-      <w:r>
-        <w:t xml:space="preserve">  127.0.0.1:51462 - "GET / HTTP/1.1" 200 OK</w:t>
+      <w:r>
+        <w:t>INFO:     127.0.0.1:51462 - "GET / HTTP/1.1" 200 OK</w:t>
       </w:r>
     </w:p>
     <w:p>
@@ -1795,14 +1295,9 @@
       </w:r>
     </w:p>
     <w:p>
-      <w:proofErr w:type="gramStart"/>
       <w:r>
         <w:lastRenderedPageBreak/>
-        <w:t xml:space="preserve">INFO:   </w:t>
-      </w:r>
-      <w:proofErr w:type="gramEnd"/>
-      <w:r>
-        <w:t xml:space="preserve">  127.0.0.1:51462 - "GET / HTTP/1.1" 200 OK</w:t>
+        <w:t>INFO:     127.0.0.1:51462 - "GET / HTTP/1.1" 200 OK</w:t>
       </w:r>
     </w:p>
     <w:p>
@@ -1817,13 +1312,8 @@
       </w:r>
     </w:p>
     <w:p>
-      <w:proofErr w:type="gramStart"/>
-      <w:r>
-        <w:t xml:space="preserve">INFO:   </w:t>
-      </w:r>
-      <w:proofErr w:type="gramEnd"/>
-      <w:r>
-        <w:t xml:space="preserve">  127.0.0.1:51464 - "GET / HTTP/1.1" 200 OK</w:t>
+      <w:r>
+        <w:t>INFO:     127.0.0.1:51464 - "GET / HTTP/1.1" 200 OK</w:t>
       </w:r>
     </w:p>
     <w:p>
@@ -1847,21 +1337,7 @@
         <w:rPr>
           <w:lang w:val="en-US"/>
         </w:rPr>
-        <w:t>INFO:     127.0.0.1:51464 - "GET /</w:t>
-      </w:r>
-      <w:proofErr w:type="spellStart"/>
-      <w:r>
-        <w:rPr>
-          <w:lang w:val="en-US"/>
-        </w:rPr>
-        <w:t>api</w:t>
-      </w:r>
-      <w:proofErr w:type="spellEnd"/>
-      <w:r>
-        <w:rPr>
-          <w:lang w:val="en-US"/>
-        </w:rPr>
-        <w:t>/my/properties HTTP/1.1" 200 OK</w:t>
+        <w:t>INFO:     127.0.0.1:51464 - "GET /api/my/properties HTTP/1.1" 200 OK</w:t>
       </w:r>
     </w:p>
     <w:p>
@@ -1885,21 +1361,7 @@
         <w:rPr>
           <w:lang w:val="en-US"/>
         </w:rPr>
-        <w:t>INFO:     127.0.0.1:51469 - "GET /</w:t>
-      </w:r>
-      <w:proofErr w:type="spellStart"/>
-      <w:r>
-        <w:rPr>
-          <w:lang w:val="en-US"/>
-        </w:rPr>
-        <w:t>api</w:t>
-      </w:r>
-      <w:proofErr w:type="spellEnd"/>
-      <w:r>
-        <w:rPr>
-          <w:lang w:val="en-US"/>
-        </w:rPr>
-        <w:t>/my/dialogs HTTP/1.1" 200 OK</w:t>
+        <w:t>INFO:     127.0.0.1:51469 - "GET /api/my/dialogs HTTP/1.1" 200 OK</w:t>
       </w:r>
     </w:p>
     <w:p>
@@ -1923,35 +1385,7 @@
         <w:rPr>
           <w:lang w:val="en-US"/>
         </w:rPr>
-        <w:t>INFO:     127.0.0.1:51472 - "POST /</w:t>
-      </w:r>
-      <w:proofErr w:type="spellStart"/>
-      <w:r>
-        <w:rPr>
-          <w:lang w:val="en-US"/>
-        </w:rPr>
-        <w:t>api</w:t>
-      </w:r>
-      <w:proofErr w:type="spellEnd"/>
-      <w:r>
-        <w:rPr>
-          <w:lang w:val="en-US"/>
-        </w:rPr>
-        <w:t xml:space="preserve">/properties HTTP/1.1" 422 </w:t>
-      </w:r>
-      <w:proofErr w:type="spellStart"/>
-      <w:r>
-        <w:rPr>
-          <w:lang w:val="en-US"/>
-        </w:rPr>
-        <w:t>Unprocessable</w:t>
-      </w:r>
-      <w:proofErr w:type="spellEnd"/>
-      <w:r>
-        <w:rPr>
-          <w:lang w:val="en-US"/>
-        </w:rPr>
-        <w:t xml:space="preserve"> Entity</w:t>
+        <w:t>INFO:     127.0.0.1:51472 - "POST /api/properties HTTP/1.1" 422 Unprocessable Entity</w:t>
       </w:r>
     </w:p>
     <w:p>
@@ -1975,35 +1409,7 @@
         <w:rPr>
           <w:lang w:val="en-US"/>
         </w:rPr>
-        <w:t>INFO:     127.0.0.1:51472 - "POST /</w:t>
-      </w:r>
-      <w:proofErr w:type="spellStart"/>
-      <w:r>
-        <w:rPr>
-          <w:lang w:val="en-US"/>
-        </w:rPr>
-        <w:t>api</w:t>
-      </w:r>
-      <w:proofErr w:type="spellEnd"/>
-      <w:r>
-        <w:rPr>
-          <w:lang w:val="en-US"/>
-        </w:rPr>
-        <w:t xml:space="preserve">/properties HTTP/1.1" 422 </w:t>
-      </w:r>
-      <w:proofErr w:type="spellStart"/>
-      <w:r>
-        <w:rPr>
-          <w:lang w:val="en-US"/>
-        </w:rPr>
-        <w:t>Unprocessable</w:t>
-      </w:r>
-      <w:proofErr w:type="spellEnd"/>
-      <w:r>
-        <w:rPr>
-          <w:lang w:val="en-US"/>
-        </w:rPr>
-        <w:t xml:space="preserve"> Entity</w:t>
+        <w:t>INFO:     127.0.0.1:51472 - "POST /api/properties HTTP/1.1" 422 Unprocessable Entity</w:t>
       </w:r>
     </w:p>
     <w:p>
@@ -2027,35 +1433,7 @@
         <w:rPr>
           <w:lang w:val="en-US"/>
         </w:rPr>
-        <w:t>INFO:     127.0.0.1:51472 - "POST /</w:t>
-      </w:r>
-      <w:proofErr w:type="spellStart"/>
-      <w:r>
-        <w:rPr>
-          <w:lang w:val="en-US"/>
-        </w:rPr>
-        <w:t>api</w:t>
-      </w:r>
-      <w:proofErr w:type="spellEnd"/>
-      <w:r>
-        <w:rPr>
-          <w:lang w:val="en-US"/>
-        </w:rPr>
-        <w:t xml:space="preserve">/properties HTTP/1.1" 422 </w:t>
-      </w:r>
-      <w:proofErr w:type="spellStart"/>
-      <w:r>
-        <w:rPr>
-          <w:lang w:val="en-US"/>
-        </w:rPr>
-        <w:t>Unprocessable</w:t>
-      </w:r>
-      <w:proofErr w:type="spellEnd"/>
-      <w:r>
-        <w:rPr>
-          <w:lang w:val="en-US"/>
-        </w:rPr>
-        <w:t xml:space="preserve"> Entity</w:t>
+        <w:t>INFO:     127.0.0.1:51472 - "POST /api/properties HTTP/1.1" 422 Unprocessable Entity</w:t>
       </w:r>
     </w:p>
     <w:p>
@@ -2081,57 +1459,21 @@
         <w:rPr>
           <w:lang w:val="en-US"/>
         </w:rPr>
-        <w:t xml:space="preserve">(index):1870 Uncaught </w:t>
-      </w:r>
-      <w:proofErr w:type="spellStart"/>
-      <w:r>
-        <w:rPr>
-          <w:lang w:val="en-US"/>
-        </w:rPr>
-        <w:t>ReferenceError</w:t>
-      </w:r>
-      <w:proofErr w:type="spellEnd"/>
-      <w:r>
-        <w:rPr>
-          <w:lang w:val="en-US"/>
-        </w:rPr>
-        <w:t xml:space="preserve">: </w:t>
-      </w:r>
-      <w:proofErr w:type="spellStart"/>
-      <w:r>
-        <w:rPr>
-          <w:lang w:val="en-US"/>
-        </w:rPr>
-        <w:t>updateModalGallery</w:t>
-      </w:r>
-      <w:proofErr w:type="spellEnd"/>
-      <w:r>
-        <w:rPr>
-          <w:lang w:val="en-US"/>
-        </w:rPr>
-        <w:t xml:space="preserve"> is not defined</w:t>
-      </w:r>
-    </w:p>
-    <w:p>
-      <w:pPr>
-        <w:rPr>
-          <w:lang w:val="en-US"/>
-        </w:rPr>
-      </w:pPr>
-      <w:r>
-        <w:rPr>
-          <w:lang w:val="en-US"/>
-        </w:rPr>
-        <w:t xml:space="preserve">    at (index</w:t>
-      </w:r>
-      <w:proofErr w:type="gramStart"/>
-      <w:r>
-        <w:rPr>
-          <w:lang w:val="en-US"/>
-        </w:rPr>
-        <w:t>):1870:36</w:t>
-      </w:r>
-      <w:proofErr w:type="gramEnd"/>
+        <w:t>(index):1870 Uncaught ReferenceError: updateModalGallery is not defined</w:t>
+      </w:r>
+    </w:p>
+    <w:p>
+      <w:pPr>
+        <w:rPr>
+          <w:lang w:val="en-US"/>
+        </w:rPr>
+      </w:pPr>
+      <w:r>
+        <w:rPr>
+          <w:lang w:val="en-US"/>
+        </w:rPr>
+        <w:t xml:space="preserve">    at (index):1870:36</w:t>
+      </w:r>
     </w:p>
     <w:p>
       <w:pPr>
@@ -2225,15 +1567,7 @@
         <w:t>из</w:t>
       </w:r>
       <w:r>
-        <w:t xml:space="preserve"> </w:t>
-      </w:r>
-      <w:proofErr w:type="spellStart"/>
-      <w:r>
-        <w:t>data</w:t>
-      </w:r>
-      <w:proofErr w:type="spellEnd"/>
-      <w:r>
-        <w:t>-</w:t>
+        <w:t xml:space="preserve"> data-</w:t>
       </w:r>
       <w:r>
         <w:rPr>
@@ -2284,15 +1618,7 @@
         <w:t>из</w:t>
       </w:r>
       <w:r>
-        <w:t xml:space="preserve"> </w:t>
-      </w:r>
-      <w:proofErr w:type="spellStart"/>
-      <w:r>
-        <w:t>data</w:t>
-      </w:r>
-      <w:proofErr w:type="spellEnd"/>
-      <w:r>
-        <w:t>-</w:t>
+        <w:t xml:space="preserve"> data-</w:t>
       </w:r>
       <w:r>
         <w:rPr>
@@ -2314,35 +1640,7 @@
         <w:rPr>
           <w:lang w:val="en-US"/>
         </w:rPr>
-        <w:t xml:space="preserve">script.js:2002 </w:t>
-      </w:r>
-      <w:proofErr w:type="spellStart"/>
-      <w:r>
-        <w:rPr>
-          <w:lang w:val="en-US"/>
-        </w:rPr>
-        <w:t>initWebSocket</w:t>
-      </w:r>
-      <w:proofErr w:type="spellEnd"/>
-      <w:r>
-        <w:rPr>
-          <w:lang w:val="en-US"/>
-        </w:rPr>
-        <w:t xml:space="preserve">: </w:t>
-      </w:r>
-      <w:proofErr w:type="spellStart"/>
-      <w:r>
-        <w:rPr>
-          <w:lang w:val="en-US"/>
-        </w:rPr>
-        <w:t>userId</w:t>
-      </w:r>
-      <w:proofErr w:type="spellEnd"/>
-      <w:r>
-        <w:rPr>
-          <w:lang w:val="en-US"/>
-        </w:rPr>
-        <w:t xml:space="preserve"> = 2 </w:t>
+        <w:t xml:space="preserve">script.js:2002 initWebSocket: userId = 2 </w:t>
       </w:r>
       <w:r>
         <w:t>попытка</w:t>
@@ -2408,15 +1706,7 @@
         <w:t>✅</w:t>
       </w:r>
       <w:r>
-        <w:t xml:space="preserve"> </w:t>
-      </w:r>
-      <w:proofErr w:type="spellStart"/>
-      <w:r>
-        <w:t>WebSocket</w:t>
-      </w:r>
-      <w:proofErr w:type="spellEnd"/>
-      <w:r>
-        <w:t xml:space="preserve"> </w:t>
+        <w:t xml:space="preserve"> WebSocket </w:t>
       </w:r>
       <w:r>
         <w:rPr>
@@ -2486,49 +1776,7 @@
         <w:rPr>
           <w:lang w:val="en-US"/>
         </w:rPr>
-        <w:t>: {"type": "</w:t>
-      </w:r>
-      <w:proofErr w:type="spellStart"/>
-      <w:r>
-        <w:rPr>
-          <w:lang w:val="en-US"/>
-        </w:rPr>
-        <w:t>status_update</w:t>
-      </w:r>
-      <w:proofErr w:type="spellEnd"/>
-      <w:r>
-        <w:rPr>
-          <w:lang w:val="en-US"/>
-        </w:rPr>
-        <w:t>", "</w:t>
-      </w:r>
-      <w:proofErr w:type="spellStart"/>
-      <w:r>
-        <w:rPr>
-          <w:lang w:val="en-US"/>
-        </w:rPr>
-        <w:t>user_id</w:t>
-      </w:r>
-      <w:proofErr w:type="spellEnd"/>
-      <w:r>
-        <w:rPr>
-          <w:lang w:val="en-US"/>
-        </w:rPr>
-        <w:t>": 2, "</w:t>
-      </w:r>
-      <w:proofErr w:type="spellStart"/>
-      <w:r>
-        <w:rPr>
-          <w:lang w:val="en-US"/>
-        </w:rPr>
-        <w:t>is_online</w:t>
-      </w:r>
-      <w:proofErr w:type="spellEnd"/>
-      <w:r>
-        <w:rPr>
-          <w:lang w:val="en-US"/>
-        </w:rPr>
-        <w:t>": true}</w:t>
+        <w:t>: {"type": "status_update", "user_id": 2, "is_online": true}</w:t>
       </w:r>
     </w:p>
     <w:p>
@@ -2546,6 +1794,11 @@
       </w:r>
     </w:p>
     <w:p>
+      <w:pPr>
+        <w:rPr>
+          <w:lang w:val="en-US"/>
+        </w:rPr>
+      </w:pPr>
       <w:r>
         <w:rPr>
           <w:lang w:val="en-US"/>
@@ -2553,28 +1806,33 @@
         <w:t>script</w:t>
       </w:r>
       <w:r>
+        <w:rPr>
+          <w:lang w:val="en-US"/>
+        </w:rPr>
         <w:t>.</w:t>
       </w:r>
-      <w:proofErr w:type="spellStart"/>
       <w:r>
         <w:rPr>
           <w:lang w:val="en-US"/>
         </w:rPr>
         <w:t>js</w:t>
       </w:r>
-      <w:proofErr w:type="spellEnd"/>
-      <w:r>
+      <w:r>
+        <w:rPr>
+          <w:lang w:val="en-US"/>
+        </w:rPr>
         <w:t xml:space="preserve">:405 </w:t>
       </w:r>
-      <w:proofErr w:type="spellStart"/>
       <w:r>
         <w:rPr>
           <w:lang w:val="en-US"/>
         </w:rPr>
         <w:t>showMyContracts</w:t>
       </w:r>
-      <w:proofErr w:type="spellEnd"/>
-      <w:r>
+      <w:r>
+        <w:rPr>
+          <w:lang w:val="en-US"/>
+        </w:rPr>
         <w:t xml:space="preserve"> </w:t>
       </w:r>
       <w:r>
@@ -2582,6 +1840,11 @@
       </w:r>
     </w:p>
     <w:p>
+      <w:pPr>
+        <w:rPr>
+          <w:lang w:val="en-US"/>
+        </w:rPr>
+      </w:pPr>
       <w:r>
         <w:rPr>
           <w:lang w:val="en-US"/>
@@ -2590,26 +1853,32 @@
         <w:t>script</w:t>
       </w:r>
       <w:r>
+        <w:rPr>
+          <w:lang w:val="en-US"/>
+        </w:rPr>
         <w:t>.</w:t>
       </w:r>
-      <w:proofErr w:type="spellStart"/>
       <w:r>
         <w:rPr>
           <w:lang w:val="en-US"/>
         </w:rPr>
         <w:t>js</w:t>
       </w:r>
-      <w:proofErr w:type="spellEnd"/>
-      <w:r>
+      <w:r>
+        <w:rPr>
+          <w:lang w:val="en-US"/>
+        </w:rPr>
         <w:t xml:space="preserve">:425 </w:t>
       </w:r>
       <w:r>
         <w:t>Договоры</w:t>
       </w:r>
       <w:r>
+        <w:rPr>
+          <w:lang w:val="en-US"/>
+        </w:rPr>
         <w:t xml:space="preserve">: </w:t>
       </w:r>
-      <w:proofErr w:type="gramStart"/>
       <w:r>
         <w:rPr>
           <w:lang w:val="en-US"/>
@@ -2617,14 +1886,18 @@
         <w:t>Array</w:t>
       </w:r>
       <w:r>
-        <w:t>(</w:t>
-      </w:r>
-      <w:proofErr w:type="gramEnd"/>
-      <w:r>
-        <w:t>2)</w:t>
-      </w:r>
-    </w:p>
-    <w:p>
+        <w:rPr>
+          <w:lang w:val="en-US"/>
+        </w:rPr>
+        <w:t>(2)</w:t>
+      </w:r>
+    </w:p>
+    <w:p>
+      <w:pPr>
+        <w:rPr>
+          <w:lang w:val="en-US"/>
+        </w:rPr>
+      </w:pPr>
       <w:r>
         <w:rPr>
           <w:lang w:val="en-US"/>
@@ -2632,28 +1905,33 @@
         <w:t>script</w:t>
       </w:r>
       <w:r>
+        <w:rPr>
+          <w:lang w:val="en-US"/>
+        </w:rPr>
         <w:t>.</w:t>
       </w:r>
-      <w:proofErr w:type="spellStart"/>
       <w:r>
         <w:rPr>
           <w:lang w:val="en-US"/>
         </w:rPr>
         <w:t>js</w:t>
       </w:r>
-      <w:proofErr w:type="spellEnd"/>
-      <w:r>
+      <w:r>
+        <w:rPr>
+          <w:lang w:val="en-US"/>
+        </w:rPr>
         <w:t xml:space="preserve">:680 </w:t>
       </w:r>
-      <w:proofErr w:type="spellStart"/>
       <w:r>
         <w:rPr>
           <w:lang w:val="en-US"/>
         </w:rPr>
         <w:t>showProfileModal</w:t>
       </w:r>
-      <w:proofErr w:type="spellEnd"/>
-      <w:r>
+      <w:r>
+        <w:rPr>
+          <w:lang w:val="en-US"/>
+        </w:rPr>
         <w:t xml:space="preserve"> </w:t>
       </w:r>
       <w:r>
@@ -2661,6 +1939,11 @@
       </w:r>
     </w:p>
     <w:p>
+      <w:pPr>
+        <w:rPr>
+          <w:lang w:val="en-US"/>
+        </w:rPr>
+      </w:pPr>
       <w:r>
         <w:rPr>
           <w:lang w:val="en-US"/>
@@ -2668,23 +1951,30 @@
         <w:t>script</w:t>
       </w:r>
       <w:r>
+        <w:rPr>
+          <w:lang w:val="en-US"/>
+        </w:rPr>
         <w:t>.</w:t>
       </w:r>
-      <w:proofErr w:type="spellStart"/>
       <w:r>
         <w:rPr>
           <w:lang w:val="en-US"/>
         </w:rPr>
         <w:t>js</w:t>
       </w:r>
-      <w:proofErr w:type="spellEnd"/>
-      <w:r>
+      <w:r>
+        <w:rPr>
+          <w:lang w:val="en-US"/>
+        </w:rPr>
         <w:t xml:space="preserve">:1213 </w:t>
       </w:r>
       <w:r>
         <w:t>Загрузка</w:t>
       </w:r>
       <w:r>
+        <w:rPr>
+          <w:lang w:val="en-US"/>
+        </w:rPr>
         <w:t xml:space="preserve"> </w:t>
       </w:r>
       <w:r>
@@ -2692,6 +1982,11 @@
       </w:r>
     </w:p>
     <w:p>
+      <w:pPr>
+        <w:rPr>
+          <w:lang w:val="en-US"/>
+        </w:rPr>
+      </w:pPr>
       <w:r>
         <w:rPr>
           <w:lang w:val="en-US"/>
@@ -2699,29 +1994,39 @@
         <w:t>script</w:t>
       </w:r>
       <w:r>
+        <w:rPr>
+          <w:lang w:val="en-US"/>
+        </w:rPr>
         <w:t>.</w:t>
       </w:r>
-      <w:proofErr w:type="spellStart"/>
       <w:r>
         <w:rPr>
           <w:lang w:val="en-US"/>
         </w:rPr>
         <w:t>js</w:t>
       </w:r>
-      <w:proofErr w:type="spellEnd"/>
-      <w:r>
+      <w:r>
+        <w:rPr>
+          <w:lang w:val="en-US"/>
+        </w:rPr>
         <w:t xml:space="preserve">:1226 </w:t>
       </w:r>
       <w:r>
         <w:t>Данные</w:t>
       </w:r>
       <w:r>
+        <w:rPr>
+          <w:lang w:val="en-US"/>
+        </w:rPr>
         <w:t xml:space="preserve"> </w:t>
       </w:r>
       <w:r>
         <w:t>профиля</w:t>
       </w:r>
       <w:r>
+        <w:rPr>
+          <w:lang w:val="en-US"/>
+        </w:rPr>
         <w:t xml:space="preserve">: </w:t>
       </w:r>
       <w:r>
@@ -2741,21 +2046,7 @@
         <w:rPr>
           <w:lang w:val="en-US"/>
         </w:rPr>
-        <w:t xml:space="preserve">script.js:672 </w:t>
-      </w:r>
-      <w:proofErr w:type="spellStart"/>
-      <w:r>
-        <w:rPr>
-          <w:lang w:val="en-US"/>
-        </w:rPr>
-        <w:t>showAgentStats</w:t>
-      </w:r>
-      <w:proofErr w:type="spellEnd"/>
-      <w:r>
-        <w:rPr>
-          <w:lang w:val="en-US"/>
-        </w:rPr>
-        <w:t xml:space="preserve"> </w:t>
+        <w:t xml:space="preserve">script.js:672 showAgentStats </w:t>
       </w:r>
       <w:r>
         <w:t>вызван</w:t>
@@ -2771,49 +2062,7 @@
         <w:rPr>
           <w:lang w:val="en-US"/>
         </w:rPr>
-        <w:t>:8000/</w:t>
-      </w:r>
-      <w:proofErr w:type="spellStart"/>
-      <w:r>
-        <w:rPr>
-          <w:lang w:val="en-US"/>
-        </w:rPr>
-        <w:t>api</w:t>
-      </w:r>
-      <w:proofErr w:type="spellEnd"/>
-      <w:r>
-        <w:rPr>
-          <w:lang w:val="en-US"/>
-        </w:rPr>
-        <w:t>/agent/</w:t>
-      </w:r>
-      <w:proofErr w:type="spellStart"/>
-      <w:r>
-        <w:rPr>
-          <w:lang w:val="en-US"/>
-        </w:rPr>
-        <w:t>stats?months</w:t>
-      </w:r>
-      <w:proofErr w:type="spellEnd"/>
-      <w:r>
-        <w:rPr>
-          <w:lang w:val="en-US"/>
-        </w:rPr>
-        <w:t>=</w:t>
-      </w:r>
-      <w:proofErr w:type="gramStart"/>
-      <w:r>
-        <w:rPr>
-          <w:lang w:val="en-US"/>
-        </w:rPr>
-        <w:t>6:1  Failed</w:t>
-      </w:r>
-      <w:proofErr w:type="gramEnd"/>
-      <w:r>
-        <w:rPr>
-          <w:lang w:val="en-US"/>
-        </w:rPr>
-        <w:t xml:space="preserve"> to load resource: the server responded with a status of 500 (Internal Server Error)</w:t>
+        <w:t>:8000/api/agent/stats?months=6:1  Failed to load resource: the server responded with a status of 500 (Internal Server Error)</w:t>
       </w:r>
     </w:p>
     <w:p>
@@ -2853,69 +2102,33 @@
         <w:rPr>
           <w:lang w:val="en-US"/>
         </w:rPr>
-        <w:t xml:space="preserve">: </w:t>
-      </w:r>
-      <w:proofErr w:type="spellStart"/>
-      <w:r>
-        <w:rPr>
-          <w:lang w:val="en-US"/>
-        </w:rPr>
-        <w:t>SyntaxError</w:t>
-      </w:r>
-      <w:proofErr w:type="spellEnd"/>
-      <w:r>
-        <w:rPr>
-          <w:lang w:val="en-US"/>
-        </w:rPr>
-        <w:t>: Unexpected token 'I', "Internal S"... is not valid JSON</w:t>
-      </w:r>
-    </w:p>
-    <w:p>
-      <w:pPr>
-        <w:rPr>
-          <w:lang w:val="en-US"/>
-        </w:rPr>
-      </w:pPr>
-      <w:proofErr w:type="spellStart"/>
-      <w:r>
-        <w:rPr>
-          <w:lang w:val="en-US"/>
-        </w:rPr>
-        <w:t>loadAgentStats</w:t>
-      </w:r>
-      <w:proofErr w:type="spellEnd"/>
-      <w:r>
-        <w:rPr>
-          <w:lang w:val="en-US"/>
-        </w:rPr>
-        <w:t xml:space="preserve"> @ script.js:1055</w:t>
-      </w:r>
-    </w:p>
-    <w:p>
-      <w:pPr>
-        <w:rPr>
-          <w:lang w:val="en-US"/>
-        </w:rPr>
-      </w:pPr>
-      <w:r>
-        <w:rPr>
-          <w:lang w:val="en-US"/>
-        </w:rPr>
-        <w:t xml:space="preserve">script.js:664 </w:t>
-      </w:r>
-      <w:proofErr w:type="spellStart"/>
-      <w:r>
-        <w:rPr>
-          <w:lang w:val="en-US"/>
-        </w:rPr>
-        <w:t>showMyProperties</w:t>
-      </w:r>
-      <w:proofErr w:type="spellEnd"/>
-      <w:r>
-        <w:rPr>
-          <w:lang w:val="en-US"/>
-        </w:rPr>
-        <w:t xml:space="preserve"> </w:t>
+        <w:t>: SyntaxError: Unexpected token 'I', "Internal S"... is not valid JSON</w:t>
+      </w:r>
+    </w:p>
+    <w:p>
+      <w:pPr>
+        <w:rPr>
+          <w:lang w:val="en-US"/>
+        </w:rPr>
+      </w:pPr>
+      <w:r>
+        <w:rPr>
+          <w:lang w:val="en-US"/>
+        </w:rPr>
+        <w:t>loadAgentStats @ script.js:1055</w:t>
+      </w:r>
+    </w:p>
+    <w:p>
+      <w:pPr>
+        <w:rPr>
+          <w:lang w:val="en-US"/>
+        </w:rPr>
+      </w:pPr>
+      <w:r>
+        <w:rPr>
+          <w:lang w:val="en-US"/>
+        </w:rPr>
+        <w:t xml:space="preserve">script.js:664 showMyProperties </w:t>
       </w:r>
       <w:r>
         <w:t>вызван</w:t>
@@ -2931,21 +2144,7 @@
         <w:rPr>
           <w:lang w:val="en-US"/>
         </w:rPr>
-        <w:t xml:space="preserve">script.js:922 </w:t>
-      </w:r>
-      <w:proofErr w:type="spellStart"/>
-      <w:r>
-        <w:rPr>
-          <w:lang w:val="en-US"/>
-        </w:rPr>
-        <w:t>loadMyProperties</w:t>
-      </w:r>
-      <w:proofErr w:type="spellEnd"/>
-      <w:r>
-        <w:rPr>
-          <w:lang w:val="en-US"/>
-        </w:rPr>
-        <w:t xml:space="preserve"> </w:t>
+        <w:t xml:space="preserve">script.js:922 loadMyProperties </w:t>
       </w:r>
       <w:r>
         <w:t>вызван</w:t>
@@ -2970,48 +2169,20 @@
         <w:rPr>
           <w:lang w:val="en-US"/>
         </w:rPr>
-        <w:t xml:space="preserve">: </w:t>
-      </w:r>
-      <w:proofErr w:type="gramStart"/>
-      <w:r>
-        <w:rPr>
-          <w:lang w:val="en-US"/>
-        </w:rPr>
-        <w:t>Array(</w:t>
-      </w:r>
-      <w:proofErr w:type="gramEnd"/>
-      <w:r>
-        <w:rPr>
-          <w:lang w:val="en-US"/>
-        </w:rPr>
-        <w:t>3)</w:t>
-      </w:r>
-    </w:p>
-    <w:p>
-      <w:pPr>
-        <w:rPr>
-          <w:lang w:val="en-US"/>
-        </w:rPr>
-      </w:pPr>
-      <w:r>
-        <w:rPr>
-          <w:lang w:val="en-US"/>
-        </w:rPr>
-        <w:t xml:space="preserve">script.js:405 </w:t>
-      </w:r>
-      <w:proofErr w:type="spellStart"/>
-      <w:r>
-        <w:rPr>
-          <w:lang w:val="en-US"/>
-        </w:rPr>
-        <w:t>showMyContracts</w:t>
-      </w:r>
-      <w:proofErr w:type="spellEnd"/>
-      <w:r>
-        <w:rPr>
-          <w:lang w:val="en-US"/>
-        </w:rPr>
-        <w:t xml:space="preserve"> </w:t>
+        <w:t>: Array(3)</w:t>
+      </w:r>
+    </w:p>
+    <w:p>
+      <w:pPr>
+        <w:rPr>
+          <w:lang w:val="en-US"/>
+        </w:rPr>
+      </w:pPr>
+      <w:r>
+        <w:rPr>
+          <w:lang w:val="en-US"/>
+        </w:rPr>
+        <w:t xml:space="preserve">script.js:405 showMyContracts </w:t>
       </w:r>
       <w:r>
         <w:t>вызван</w:t>
@@ -3036,48 +2207,20 @@
         <w:rPr>
           <w:lang w:val="en-US"/>
         </w:rPr>
-        <w:t xml:space="preserve">: </w:t>
-      </w:r>
-      <w:proofErr w:type="gramStart"/>
-      <w:r>
-        <w:rPr>
-          <w:lang w:val="en-US"/>
-        </w:rPr>
-        <w:t>Array(</w:t>
-      </w:r>
-      <w:proofErr w:type="gramEnd"/>
-      <w:r>
-        <w:rPr>
-          <w:lang w:val="en-US"/>
-        </w:rPr>
-        <w:t>2)</w:t>
-      </w:r>
-    </w:p>
-    <w:p>
-      <w:pPr>
-        <w:rPr>
-          <w:lang w:val="en-US"/>
-        </w:rPr>
-      </w:pPr>
-      <w:r>
-        <w:rPr>
-          <w:lang w:val="en-US"/>
-        </w:rPr>
-        <w:t xml:space="preserve">script.js:394 </w:t>
-      </w:r>
-      <w:proofErr w:type="spellStart"/>
-      <w:r>
-        <w:rPr>
-          <w:lang w:val="en-US"/>
-        </w:rPr>
-        <w:t>showMyApplications</w:t>
-      </w:r>
-      <w:proofErr w:type="spellEnd"/>
-      <w:r>
-        <w:rPr>
-          <w:lang w:val="en-US"/>
-        </w:rPr>
-        <w:t xml:space="preserve"> </w:t>
+        <w:t>: Array(2)</w:t>
+      </w:r>
+    </w:p>
+    <w:p>
+      <w:pPr>
+        <w:rPr>
+          <w:lang w:val="en-US"/>
+        </w:rPr>
+      </w:pPr>
+      <w:r>
+        <w:rPr>
+          <w:lang w:val="en-US"/>
+        </w:rPr>
+        <w:t xml:space="preserve">script.js:394 showMyApplications </w:t>
       </w:r>
       <w:r>
         <w:t>вызван</w:t>
@@ -3102,48 +2245,20 @@
         <w:rPr>
           <w:lang w:val="en-US"/>
         </w:rPr>
-        <w:t xml:space="preserve">: </w:t>
-      </w:r>
-      <w:proofErr w:type="gramStart"/>
-      <w:r>
-        <w:rPr>
-          <w:lang w:val="en-US"/>
-        </w:rPr>
-        <w:t>Array(</w:t>
-      </w:r>
-      <w:proofErr w:type="gramEnd"/>
-      <w:r>
-        <w:rPr>
-          <w:lang w:val="en-US"/>
-        </w:rPr>
-        <w:t>7)</w:t>
-      </w:r>
-    </w:p>
-    <w:p>
-      <w:pPr>
-        <w:rPr>
-          <w:lang w:val="en-US"/>
-        </w:rPr>
-      </w:pPr>
-      <w:r>
-        <w:rPr>
-          <w:lang w:val="en-US"/>
-        </w:rPr>
-        <w:t xml:space="preserve">script.js:664 </w:t>
-      </w:r>
-      <w:proofErr w:type="spellStart"/>
-      <w:r>
-        <w:rPr>
-          <w:lang w:val="en-US"/>
-        </w:rPr>
-        <w:t>showMyProperties</w:t>
-      </w:r>
-      <w:proofErr w:type="spellEnd"/>
-      <w:r>
-        <w:rPr>
-          <w:lang w:val="en-US"/>
-        </w:rPr>
-        <w:t xml:space="preserve"> </w:t>
+        <w:t>: Array(7)</w:t>
+      </w:r>
+    </w:p>
+    <w:p>
+      <w:pPr>
+        <w:rPr>
+          <w:lang w:val="en-US"/>
+        </w:rPr>
+      </w:pPr>
+      <w:r>
+        <w:rPr>
+          <w:lang w:val="en-US"/>
+        </w:rPr>
+        <w:t xml:space="preserve">script.js:664 showMyProperties </w:t>
       </w:r>
       <w:r>
         <w:t>вызван</w:t>
@@ -3159,21 +2274,7 @@
         <w:rPr>
           <w:lang w:val="en-US"/>
         </w:rPr>
-        <w:t xml:space="preserve">script.js:922 </w:t>
-      </w:r>
-      <w:proofErr w:type="spellStart"/>
-      <w:r>
-        <w:rPr>
-          <w:lang w:val="en-US"/>
-        </w:rPr>
-        <w:t>loadMyProperties</w:t>
-      </w:r>
-      <w:proofErr w:type="spellEnd"/>
-      <w:r>
-        <w:rPr>
-          <w:lang w:val="en-US"/>
-        </w:rPr>
-        <w:t xml:space="preserve"> </w:t>
+        <w:t xml:space="preserve">script.js:922 loadMyProperties </w:t>
       </w:r>
       <w:r>
         <w:t>вызван</w:t>
@@ -3198,21 +2299,7 @@
         <w:rPr>
           <w:lang w:val="en-US"/>
         </w:rPr>
-        <w:t xml:space="preserve">: </w:t>
-      </w:r>
-      <w:proofErr w:type="gramStart"/>
-      <w:r>
-        <w:rPr>
-          <w:lang w:val="en-US"/>
-        </w:rPr>
-        <w:t>Array(</w:t>
-      </w:r>
-      <w:proofErr w:type="gramEnd"/>
-      <w:r>
-        <w:rPr>
-          <w:lang w:val="en-US"/>
-        </w:rPr>
-        <w:t>3)</w:t>
+        <w:t>: Array(3)</w:t>
       </w:r>
     </w:p>
     <w:p>
@@ -3237,21 +2324,7 @@
         <w:rPr>
           <w:lang w:val="en-US"/>
         </w:rPr>
-        <w:t xml:space="preserve"> </w:t>
-      </w:r>
-      <w:proofErr w:type="spellStart"/>
-      <w:r>
-        <w:rPr>
-          <w:lang w:val="en-US"/>
-        </w:rPr>
-        <w:t>showAddPropertyModal</w:t>
-      </w:r>
-      <w:proofErr w:type="spellEnd"/>
-      <w:r>
-        <w:rPr>
-          <w:lang w:val="en-US"/>
-        </w:rPr>
-        <w:t xml:space="preserve"> </w:t>
+        <w:t xml:space="preserve"> showAddPropertyModal </w:t>
       </w:r>
       <w:r>
         <w:t>вызван</w:t>
@@ -3267,62 +2340,20 @@
         <w:rPr>
           <w:lang w:val="en-US"/>
         </w:rPr>
-        <w:t xml:space="preserve">(index):1 Uncaught </w:t>
-      </w:r>
-      <w:proofErr w:type="spellStart"/>
-      <w:r>
-        <w:rPr>
-          <w:lang w:val="en-US"/>
-        </w:rPr>
-        <w:t>TypeError</w:t>
-      </w:r>
-      <w:proofErr w:type="spellEnd"/>
-      <w:r>
-        <w:rPr>
-          <w:lang w:val="en-US"/>
-        </w:rPr>
-        <w:t xml:space="preserve">: </w:t>
-      </w:r>
-      <w:proofErr w:type="spellStart"/>
-      <w:r>
-        <w:rPr>
-          <w:lang w:val="en-US"/>
-        </w:rPr>
-        <w:t>URL.revokeObjectURL</w:t>
-      </w:r>
-      <w:proofErr w:type="spellEnd"/>
-      <w:r>
-        <w:rPr>
-          <w:lang w:val="en-US"/>
-        </w:rPr>
-        <w:t xml:space="preserve"> is not a function</w:t>
-      </w:r>
-    </w:p>
-    <w:p>
-      <w:pPr>
-        <w:rPr>
-          <w:lang w:val="en-US"/>
-        </w:rPr>
-      </w:pPr>
-      <w:r>
-        <w:rPr>
-          <w:lang w:val="en-US"/>
-        </w:rPr>
-        <w:t xml:space="preserve">    at </w:t>
-      </w:r>
-      <w:proofErr w:type="spellStart"/>
-      <w:r>
-        <w:rPr>
-          <w:lang w:val="en-US"/>
-        </w:rPr>
-        <w:t>HTMLImageElement.onload</w:t>
-      </w:r>
-      <w:proofErr w:type="spellEnd"/>
-      <w:r>
-        <w:rPr>
-          <w:lang w:val="en-US"/>
-        </w:rPr>
-        <w:t xml:space="preserve"> ((index):1:5)</w:t>
+        <w:t>(index):1 Uncaught TypeError: URL.revokeObjectURL is not a function</w:t>
+      </w:r>
+    </w:p>
+    <w:p>
+      <w:pPr>
+        <w:rPr>
+          <w:lang w:val="en-US"/>
+        </w:rPr>
+      </w:pPr>
+      <w:r>
+        <w:rPr>
+          <w:lang w:val="en-US"/>
+        </w:rPr>
+        <w:t xml:space="preserve">    at HTMLImageElement.onload ((index):1:5)</w:t>
       </w:r>
     </w:p>
     <w:p>
@@ -3386,49 +2417,7 @@
         <w:rPr>
           <w:lang w:val="en-US"/>
         </w:rPr>
-        <w:t>:8000/</w:t>
-      </w:r>
-      <w:proofErr w:type="spellStart"/>
-      <w:r>
-        <w:rPr>
-          <w:lang w:val="en-US"/>
-        </w:rPr>
-        <w:t>api</w:t>
-      </w:r>
-      <w:proofErr w:type="spellEnd"/>
-      <w:r>
-        <w:rPr>
-          <w:lang w:val="en-US"/>
-        </w:rPr>
-        <w:t>/properties:</w:t>
-      </w:r>
-      <w:proofErr w:type="gramStart"/>
-      <w:r>
-        <w:rPr>
-          <w:lang w:val="en-US"/>
-        </w:rPr>
-        <w:t>1  Failed</w:t>
-      </w:r>
-      <w:proofErr w:type="gramEnd"/>
-      <w:r>
-        <w:rPr>
-          <w:lang w:val="en-US"/>
-        </w:rPr>
-        <w:t xml:space="preserve"> to load resource: the server responded with a status of 422 (</w:t>
-      </w:r>
-      <w:proofErr w:type="spellStart"/>
-      <w:r>
-        <w:rPr>
-          <w:lang w:val="en-US"/>
-        </w:rPr>
-        <w:t>Unprocessable</w:t>
-      </w:r>
-      <w:proofErr w:type="spellEnd"/>
-      <w:r>
-        <w:rPr>
-          <w:lang w:val="en-US"/>
-        </w:rPr>
-        <w:t xml:space="preserve"> Entity)</w:t>
+        <w:t>:8000/api/properties:1  Failed to load resource: the server responded with a status of 422 (Unprocessable Entity)</w:t>
       </w:r>
     </w:p>
     <w:p>
@@ -3471,77 +2460,7 @@
         <w:rPr>
           <w:lang w:val="en-US"/>
         </w:rPr>
-        <w:t>: {"detail</w:t>
-      </w:r>
-      <w:proofErr w:type="gramStart"/>
-      <w:r>
-        <w:rPr>
-          <w:lang w:val="en-US"/>
-        </w:rPr>
-        <w:t>":[</w:t>
-      </w:r>
-      <w:proofErr w:type="gramEnd"/>
-      <w:r>
-        <w:rPr>
-          <w:lang w:val="en-US"/>
-        </w:rPr>
-        <w:t>{"</w:t>
-      </w:r>
-      <w:proofErr w:type="spellStart"/>
-      <w:r>
-        <w:rPr>
-          <w:lang w:val="en-US"/>
-        </w:rPr>
-        <w:t>type":"missing","loc</w:t>
-      </w:r>
-      <w:proofErr w:type="spellEnd"/>
-      <w:r>
-        <w:rPr>
-          <w:lang w:val="en-US"/>
-        </w:rPr>
-        <w:t>":["</w:t>
-      </w:r>
-      <w:proofErr w:type="spellStart"/>
-      <w:r>
-        <w:rPr>
-          <w:lang w:val="en-US"/>
-        </w:rPr>
-        <w:t>body","data</w:t>
-      </w:r>
-      <w:proofErr w:type="spellEnd"/>
-      <w:r>
-        <w:rPr>
-          <w:lang w:val="en-US"/>
-        </w:rPr>
-        <w:t>"],"</w:t>
-      </w:r>
-      <w:proofErr w:type="spellStart"/>
-      <w:r>
-        <w:rPr>
-          <w:lang w:val="en-US"/>
-        </w:rPr>
-        <w:t>msg":"Field</w:t>
-      </w:r>
-      <w:proofErr w:type="spellEnd"/>
-      <w:r>
-        <w:rPr>
-          <w:lang w:val="en-US"/>
-        </w:rPr>
-        <w:t xml:space="preserve"> </w:t>
-      </w:r>
-      <w:proofErr w:type="spellStart"/>
-      <w:r>
-        <w:rPr>
-          <w:lang w:val="en-US"/>
-        </w:rPr>
-        <w:t>required","input":null</w:t>
-      </w:r>
-      <w:proofErr w:type="spellEnd"/>
-      <w:r>
-        <w:rPr>
-          <w:lang w:val="en-US"/>
-        </w:rPr>
-        <w:t>}]}</w:t>
+        <w:t>: {"detail":[{"type":"missing","loc":["body","data"],"msg":"Field required","input":null}]}</w:t>
       </w:r>
     </w:p>
     <w:p>
@@ -3592,29 +2511,7 @@
         <w:rPr>
           <w:lang w:val="en-US"/>
         </w:rPr>
-        <w:t xml:space="preserve">    at </w:t>
-      </w:r>
-      <w:proofErr w:type="spellStart"/>
-      <w:proofErr w:type="gramStart"/>
-      <w:r>
-        <w:rPr>
-          <w:lang w:val="en-US"/>
-        </w:rPr>
-        <w:t>HTMLFormElement</w:t>
-      </w:r>
-      <w:proofErr w:type="spellEnd"/>
-      <w:r>
-        <w:rPr>
-          <w:lang w:val="en-US"/>
-        </w:rPr>
-        <w:t>.&lt;</w:t>
-      </w:r>
-      <w:proofErr w:type="gramEnd"/>
-      <w:r>
-        <w:rPr>
-          <w:lang w:val="en-US"/>
-        </w:rPr>
-        <w:t>anonymous&gt; (script.js:2360:27)</w:t>
+        <w:t xml:space="preserve">    at HTMLFormElement.&lt;anonymous&gt; (script.js:2360:27)</w:t>
       </w:r>
     </w:p>
     <w:p>
@@ -3692,49 +2589,7 @@
         <w:rPr>
           <w:lang w:val="en-US"/>
         </w:rPr>
-        <w:t>:8000/</w:t>
-      </w:r>
-      <w:proofErr w:type="spellStart"/>
-      <w:r>
-        <w:rPr>
-          <w:lang w:val="en-US"/>
-        </w:rPr>
-        <w:t>api</w:t>
-      </w:r>
-      <w:proofErr w:type="spellEnd"/>
-      <w:r>
-        <w:rPr>
-          <w:lang w:val="en-US"/>
-        </w:rPr>
-        <w:t>/properties:</w:t>
-      </w:r>
-      <w:proofErr w:type="gramStart"/>
-      <w:r>
-        <w:rPr>
-          <w:lang w:val="en-US"/>
-        </w:rPr>
-        <w:t>1  Failed</w:t>
-      </w:r>
-      <w:proofErr w:type="gramEnd"/>
-      <w:r>
-        <w:rPr>
-          <w:lang w:val="en-US"/>
-        </w:rPr>
-        <w:t xml:space="preserve"> to load resource: the server responded with a status of 422 (</w:t>
-      </w:r>
-      <w:proofErr w:type="spellStart"/>
-      <w:r>
-        <w:rPr>
-          <w:lang w:val="en-US"/>
-        </w:rPr>
-        <w:t>Unprocessable</w:t>
-      </w:r>
-      <w:proofErr w:type="spellEnd"/>
-      <w:r>
-        <w:rPr>
-          <w:lang w:val="en-US"/>
-        </w:rPr>
-        <w:t xml:space="preserve"> Entity)</w:t>
+        <w:t>:8000/api/properties:1  Failed to load resource: the server responded with a status of 422 (Unprocessable Entity)</w:t>
       </w:r>
     </w:p>
     <w:p>
@@ -3777,77 +2632,7 @@
         <w:rPr>
           <w:lang w:val="en-US"/>
         </w:rPr>
-        <w:t>: {"detail</w:t>
-      </w:r>
-      <w:proofErr w:type="gramStart"/>
-      <w:r>
-        <w:rPr>
-          <w:lang w:val="en-US"/>
-        </w:rPr>
-        <w:t>":[</w:t>
-      </w:r>
-      <w:proofErr w:type="gramEnd"/>
-      <w:r>
-        <w:rPr>
-          <w:lang w:val="en-US"/>
-        </w:rPr>
-        <w:t>{"</w:t>
-      </w:r>
-      <w:proofErr w:type="spellStart"/>
-      <w:r>
-        <w:rPr>
-          <w:lang w:val="en-US"/>
-        </w:rPr>
-        <w:t>type":"missing","loc</w:t>
-      </w:r>
-      <w:proofErr w:type="spellEnd"/>
-      <w:r>
-        <w:rPr>
-          <w:lang w:val="en-US"/>
-        </w:rPr>
-        <w:t>":["</w:t>
-      </w:r>
-      <w:proofErr w:type="spellStart"/>
-      <w:r>
-        <w:rPr>
-          <w:lang w:val="en-US"/>
-        </w:rPr>
-        <w:t>body","data</w:t>
-      </w:r>
-      <w:proofErr w:type="spellEnd"/>
-      <w:r>
-        <w:rPr>
-          <w:lang w:val="en-US"/>
-        </w:rPr>
-        <w:t>"],"</w:t>
-      </w:r>
-      <w:proofErr w:type="spellStart"/>
-      <w:r>
-        <w:rPr>
-          <w:lang w:val="en-US"/>
-        </w:rPr>
-        <w:t>msg":"Field</w:t>
-      </w:r>
-      <w:proofErr w:type="spellEnd"/>
-      <w:r>
-        <w:rPr>
-          <w:lang w:val="en-US"/>
-        </w:rPr>
-        <w:t xml:space="preserve"> </w:t>
-      </w:r>
-      <w:proofErr w:type="spellStart"/>
-      <w:r>
-        <w:rPr>
-          <w:lang w:val="en-US"/>
-        </w:rPr>
-        <w:t>required","input":null</w:t>
-      </w:r>
-      <w:proofErr w:type="spellEnd"/>
-      <w:r>
-        <w:rPr>
-          <w:lang w:val="en-US"/>
-        </w:rPr>
-        <w:t>}]}</w:t>
+        <w:t>: {"detail":[{"type":"missing","loc":["body","data"],"msg":"Field required","input":null}]}</w:t>
       </w:r>
     </w:p>
     <w:p>
@@ -3898,29 +2683,7 @@
         <w:rPr>
           <w:lang w:val="en-US"/>
         </w:rPr>
-        <w:t xml:space="preserve">    at </w:t>
-      </w:r>
-      <w:proofErr w:type="spellStart"/>
-      <w:proofErr w:type="gramStart"/>
-      <w:r>
-        <w:rPr>
-          <w:lang w:val="en-US"/>
-        </w:rPr>
-        <w:t>HTMLFormElement</w:t>
-      </w:r>
-      <w:proofErr w:type="spellEnd"/>
-      <w:r>
-        <w:rPr>
-          <w:lang w:val="en-US"/>
-        </w:rPr>
-        <w:t>.&lt;</w:t>
-      </w:r>
-      <w:proofErr w:type="gramEnd"/>
-      <w:r>
-        <w:rPr>
-          <w:lang w:val="en-US"/>
-        </w:rPr>
-        <w:t>anonymous&gt; (script.js:2360:27)</w:t>
+        <w:t xml:space="preserve">    at HTMLFormElement.&lt;anonymous&gt; (script.js:2360:27)</w:t>
       </w:r>
     </w:p>
     <w:p>
@@ -3997,49 +2760,7 @@
         <w:rPr>
           <w:lang w:val="en-US"/>
         </w:rPr>
-        <w:t>:8000/</w:t>
-      </w:r>
-      <w:proofErr w:type="spellStart"/>
-      <w:r>
-        <w:rPr>
-          <w:lang w:val="en-US"/>
-        </w:rPr>
-        <w:t>api</w:t>
-      </w:r>
-      <w:proofErr w:type="spellEnd"/>
-      <w:r>
-        <w:rPr>
-          <w:lang w:val="en-US"/>
-        </w:rPr>
-        <w:t>/properties:</w:t>
-      </w:r>
-      <w:proofErr w:type="gramStart"/>
-      <w:r>
-        <w:rPr>
-          <w:lang w:val="en-US"/>
-        </w:rPr>
-        <w:t>1  Failed</w:t>
-      </w:r>
-      <w:proofErr w:type="gramEnd"/>
-      <w:r>
-        <w:rPr>
-          <w:lang w:val="en-US"/>
-        </w:rPr>
-        <w:t xml:space="preserve"> to load resource: the server responded with a status of 422 (</w:t>
-      </w:r>
-      <w:proofErr w:type="spellStart"/>
-      <w:r>
-        <w:rPr>
-          <w:lang w:val="en-US"/>
-        </w:rPr>
-        <w:t>Unprocessable</w:t>
-      </w:r>
-      <w:proofErr w:type="spellEnd"/>
-      <w:r>
-        <w:rPr>
-          <w:lang w:val="en-US"/>
-        </w:rPr>
-        <w:t xml:space="preserve"> Entity)</w:t>
+        <w:t>:8000/api/properties:1  Failed to load resource: the server responded with a status of 422 (Unprocessable Entity)</w:t>
       </w:r>
     </w:p>
     <w:p>
@@ -4082,77 +2803,7 @@
         <w:rPr>
           <w:lang w:val="en-US"/>
         </w:rPr>
-        <w:t>: {"detail</w:t>
-      </w:r>
-      <w:proofErr w:type="gramStart"/>
-      <w:r>
-        <w:rPr>
-          <w:lang w:val="en-US"/>
-        </w:rPr>
-        <w:t>":[</w:t>
-      </w:r>
-      <w:proofErr w:type="gramEnd"/>
-      <w:r>
-        <w:rPr>
-          <w:lang w:val="en-US"/>
-        </w:rPr>
-        <w:t>{"</w:t>
-      </w:r>
-      <w:proofErr w:type="spellStart"/>
-      <w:r>
-        <w:rPr>
-          <w:lang w:val="en-US"/>
-        </w:rPr>
-        <w:t>type":"missing","loc</w:t>
-      </w:r>
-      <w:proofErr w:type="spellEnd"/>
-      <w:r>
-        <w:rPr>
-          <w:lang w:val="en-US"/>
-        </w:rPr>
-        <w:t>":["</w:t>
-      </w:r>
-      <w:proofErr w:type="spellStart"/>
-      <w:r>
-        <w:rPr>
-          <w:lang w:val="en-US"/>
-        </w:rPr>
-        <w:t>body","data</w:t>
-      </w:r>
-      <w:proofErr w:type="spellEnd"/>
-      <w:r>
-        <w:rPr>
-          <w:lang w:val="en-US"/>
-        </w:rPr>
-        <w:t>"],"</w:t>
-      </w:r>
-      <w:proofErr w:type="spellStart"/>
-      <w:r>
-        <w:rPr>
-          <w:lang w:val="en-US"/>
-        </w:rPr>
-        <w:t>msg":"Field</w:t>
-      </w:r>
-      <w:proofErr w:type="spellEnd"/>
-      <w:r>
-        <w:rPr>
-          <w:lang w:val="en-US"/>
-        </w:rPr>
-        <w:t xml:space="preserve"> </w:t>
-      </w:r>
-      <w:proofErr w:type="spellStart"/>
-      <w:r>
-        <w:rPr>
-          <w:lang w:val="en-US"/>
-        </w:rPr>
-        <w:t>required","input":null</w:t>
-      </w:r>
-      <w:proofErr w:type="spellEnd"/>
-      <w:r>
-        <w:rPr>
-          <w:lang w:val="en-US"/>
-        </w:rPr>
-        <w:t>}]}</w:t>
+        <w:t>: {"detail":[{"type":"missing","loc":["body","data"],"msg":"Field required","input":null}]}</w:t>
       </w:r>
     </w:p>
     <w:p>
@@ -4203,42 +2854,12 @@
         <w:rPr>
           <w:lang w:val="en-US"/>
         </w:rPr>
-        <w:t xml:space="preserve">    at </w:t>
-      </w:r>
-      <w:proofErr w:type="spellStart"/>
-      <w:proofErr w:type="gramStart"/>
-      <w:r>
-        <w:rPr>
-          <w:lang w:val="en-US"/>
-        </w:rPr>
-        <w:t>HTMLFormElement</w:t>
-      </w:r>
-      <w:proofErr w:type="spellEnd"/>
-      <w:r>
-        <w:rPr>
-          <w:lang w:val="en-US"/>
-        </w:rPr>
-        <w:t>.&lt;</w:t>
-      </w:r>
-      <w:proofErr w:type="gramEnd"/>
-      <w:r>
-        <w:rPr>
-          <w:lang w:val="en-US"/>
-        </w:rPr>
-        <w:t>anonymous&gt; (script.js:2360:27)</w:t>
-      </w:r>
-    </w:p>
-    <w:p>
-      <w:r>
-        <w:t>(</w:t>
-      </w:r>
-      <w:proofErr w:type="spellStart"/>
-      <w:r>
-        <w:t>anonymous</w:t>
-      </w:r>
-      <w:proofErr w:type="spellEnd"/>
-      <w:r>
-        <w:t>) @ script.js:2391</w:t>
+        <w:t xml:space="preserve">    at HTMLFormElement.&lt;anonymous&gt; (script.js:2360:27)</w:t>
+      </w:r>
+    </w:p>
+    <w:p>
+      <w:r>
+        <w:t>(anonymous) @ script.js:2391</w:t>
       </w:r>
     </w:p>
     <w:p/>
@@ -4303,81 +2924,37 @@
           <w:lang w:val="en-US"/>
         </w:rPr>
       </w:pPr>
-      <w:proofErr w:type="gramStart"/>
-      <w:r>
-        <w:rPr>
-          <w:lang w:val="en-US"/>
-        </w:rPr>
-        <w:t>:8000/favicon.ico</w:t>
-      </w:r>
-      <w:proofErr w:type="gramEnd"/>
-      <w:r>
-        <w:rPr>
-          <w:lang w:val="en-US"/>
-        </w:rPr>
-        <w:t>:1  Failed to load resource: the server responded with a status of 404 (Not Found)</w:t>
-      </w:r>
-    </w:p>
-    <w:p>
-      <w:pPr>
-        <w:rPr>
-          <w:lang w:val="en-US"/>
-        </w:rPr>
-      </w:pPr>
-      <w:proofErr w:type="gramStart"/>
-      <w:r>
-        <w:rPr>
-          <w:lang w:val="en-US"/>
-        </w:rPr>
-        <w:t>:8000/favicon.ico</w:t>
-      </w:r>
-      <w:proofErr w:type="gramEnd"/>
-      <w:r>
-        <w:rPr>
-          <w:lang w:val="en-US"/>
-        </w:rPr>
-        <w:t>:1  Failed to load resource: the server responded with a status of 404 (Not Found)</w:t>
-      </w:r>
-    </w:p>
-    <w:p>
-      <w:pPr>
-        <w:rPr>
-          <w:lang w:val="en-US"/>
-        </w:rPr>
-      </w:pPr>
-      <w:r>
-        <w:rPr>
-          <w:lang w:val="en-US"/>
-        </w:rPr>
-        <w:t>search?page=1&amp;search=&amp;city=%D0%9E%D1%80%D0%B5%D1%85%D0%BE%D0%B2%D0%BE-%D0%97%D1%83%D0%B5%D0%B2%D0%B…:</w:t>
-      </w:r>
-      <w:proofErr w:type="gramStart"/>
-      <w:r>
-        <w:rPr>
-          <w:lang w:val="en-US"/>
-        </w:rPr>
-        <w:t>1  Failed</w:t>
-      </w:r>
-      <w:proofErr w:type="gramEnd"/>
-      <w:r>
-        <w:rPr>
-          <w:lang w:val="en-US"/>
-        </w:rPr>
-        <w:t xml:space="preserve"> to load resource: the server responded with a status of 422 (</w:t>
-      </w:r>
-      <w:proofErr w:type="spellStart"/>
-      <w:r>
-        <w:rPr>
-          <w:lang w:val="en-US"/>
-        </w:rPr>
-        <w:t>Unprocessable</w:t>
-      </w:r>
-      <w:proofErr w:type="spellEnd"/>
-      <w:r>
-        <w:rPr>
-          <w:lang w:val="en-US"/>
-        </w:rPr>
-        <w:t xml:space="preserve"> Entity)</w:t>
+      <w:r>
+        <w:rPr>
+          <w:lang w:val="en-US"/>
+        </w:rPr>
+        <w:t>:8000/favicon.ico:1  Failed to load resource: the server responded with a status of 404 (Not Found)</w:t>
+      </w:r>
+    </w:p>
+    <w:p>
+      <w:pPr>
+        <w:rPr>
+          <w:lang w:val="en-US"/>
+        </w:rPr>
+      </w:pPr>
+      <w:r>
+        <w:rPr>
+          <w:lang w:val="en-US"/>
+        </w:rPr>
+        <w:t>:8000/favicon.ico:1  Failed to load resource: the server responded with a status of 404 (Not Found)</w:t>
+      </w:r>
+    </w:p>
+    <w:p>
+      <w:pPr>
+        <w:rPr>
+          <w:lang w:val="en-US"/>
+        </w:rPr>
+      </w:pPr>
+      <w:r>
+        <w:rPr>
+          <w:lang w:val="en-US"/>
+        </w:rPr>
+        <w:t>search?page=1&amp;search=&amp;city=%D0%9E%D1%80%D0%B5%D1%85%D0%BE%D0%B2%D0%BE-%D0%97%D1%83%D0%B5%D0%B2%D0%B…:1  Failed to load resource: the server responded with a status of 422 (Unprocessable Entity)</w:t>
       </w:r>
     </w:p>
     <w:p>
@@ -4552,14 +3129,12 @@
       <w:r>
         <w:t xml:space="preserve">под </w:t>
       </w:r>
-      <w:proofErr w:type="spellStart"/>
       <w:r>
         <w:rPr>
           <w:lang w:val="en-US"/>
         </w:rPr>
         <w:t>downloadAct</w:t>
       </w:r>
-      <w:proofErr w:type="spellEnd"/>
       <w:r>
         <w:t xml:space="preserve"> </w:t>
       </w:r>
@@ -4575,39 +3150,24 @@
       <w:r>
         <w:t>.</w:t>
       </w:r>
-      <w:proofErr w:type="spellStart"/>
       <w:r>
         <w:rPr>
           <w:lang w:val="en-US"/>
         </w:rPr>
         <w:t>js</w:t>
       </w:r>
-      <w:proofErr w:type="spellEnd"/>
     </w:p>
     <w:p/>
     <w:p>
       <w:r>
-        <w:t xml:space="preserve">Не </w:t>
-      </w:r>
-      <w:proofErr w:type="spellStart"/>
-      <w:r>
-        <w:t>загрудается</w:t>
-      </w:r>
-      <w:proofErr w:type="spellEnd"/>
-      <w:r>
-        <w:t xml:space="preserve"> статистика за </w:t>
-      </w:r>
-      <w:proofErr w:type="spellStart"/>
-      <w:r>
-        <w:t>оперделенный</w:t>
-      </w:r>
-      <w:proofErr w:type="spellEnd"/>
-      <w:r>
-        <w:t xml:space="preserve"> период</w:t>
-      </w:r>
-    </w:p>
-    <w:p>
-      <w:r>
+        <w:t>Не загрудается статистика за оперделенный период</w:t>
+      </w:r>
+    </w:p>
+    <w:p>
+      <w:r>
+        <w:rPr>
+          <w:noProof/>
+        </w:rPr>
         <w:drawing>
           <wp:inline distT="0" distB="0" distL="0" distR="0" wp14:anchorId="371721E3" wp14:editId="73EED7B7">
             <wp:extent cx="5940425" cy="3446145"/>
@@ -4645,6 +3205,80 @@
         </w:drawing>
       </w:r>
     </w:p>
+    <w:p/>
+    <w:p>
+      <w:r>
+        <w:lastRenderedPageBreak/>
+        <w:drawing>
+          <wp:inline distT="0" distB="0" distL="0" distR="0" wp14:anchorId="3B198C79" wp14:editId="7B61B70B">
+            <wp:extent cx="5940425" cy="3274695"/>
+            <wp:effectExtent l="0" t="0" r="3175" b="1905"/>
+            <wp:docPr id="7" name="Рисунок 7"/>
+            <wp:cNvGraphicFramePr>
+              <a:graphicFrameLocks xmlns:a="http://schemas.openxmlformats.org/drawingml/2006/main" noChangeAspect="1"/>
+            </wp:cNvGraphicFramePr>
+            <a:graphic xmlns:a="http://schemas.openxmlformats.org/drawingml/2006/main">
+              <a:graphicData uri="http://schemas.openxmlformats.org/drawingml/2006/picture">
+                <pic:pic xmlns:pic="http://schemas.openxmlformats.org/drawingml/2006/picture">
+                  <pic:nvPicPr>
+                    <pic:cNvPr id="1" name=""/>
+                    <pic:cNvPicPr/>
+                  </pic:nvPicPr>
+                  <pic:blipFill>
+                    <a:blip r:embed="rId11"/>
+                    <a:stretch>
+                      <a:fillRect/>
+                    </a:stretch>
+                  </pic:blipFill>
+                  <pic:spPr>
+                    <a:xfrm>
+                      <a:off x="0" y="0"/>
+                      <a:ext cx="5940425" cy="3274695"/>
+                    </a:xfrm>
+                    <a:prstGeom prst="rect">
+                      <a:avLst/>
+                    </a:prstGeom>
+                  </pic:spPr>
+                </pic:pic>
+              </a:graphicData>
+            </a:graphic>
+          </wp:inline>
+        </w:drawing>
+      </w:r>
+    </w:p>
+    <w:p>
+      <w:pPr>
+        <w:rPr>
+          <w:rFonts w:ascii="Times New Roman" w:hAnsi="Times New Roman" w:cs="Times New Roman"/>
+        </w:rPr>
+      </w:pPr>
+      <w:r>
+        <w:rPr>
+          <w:rFonts w:ascii="Times New Roman" w:hAnsi="Times New Roman" w:cs="Times New Roman"/>
+          <w:sz w:val="24"/>
+          <w:szCs w:val="24"/>
+        </w:rPr>
+        <w:t>Нет модуля jwt. Решение</w:t>
+      </w:r>
+      <w:r>
+        <w:rPr>
+          <w:rFonts w:ascii="Times New Roman" w:hAnsi="Times New Roman" w:cs="Times New Roman"/>
+          <w:sz w:val="24"/>
+          <w:szCs w:val="24"/>
+          <w:lang w:val="en-US"/>
+        </w:rPr>
+        <w:t>:</w:t>
+      </w:r>
+      <w:r>
+        <w:rPr>
+          <w:rFonts w:ascii="Times New Roman" w:hAnsi="Times New Roman" w:cs="Times New Roman"/>
+          <w:sz w:val="24"/>
+          <w:szCs w:val="24"/>
+        </w:rPr>
+        <w:t xml:space="preserve"> установить pip install PyJWT</w:t>
+      </w:r>
+    </w:p>
+    <w:p/>
     <w:p/>
     <w:sectPr>
       <w:pgSz w:w="11906" w:h="16838"/>
@@ -5132,6 +3766,11 @@
       <w:lang w:eastAsia="ru-RU"/>
     </w:rPr>
   </w:style>
+  <w:style w:type="character" w:customStyle="1" w:styleId="token">
+    <w:name w:val="token"/>
+    <w:basedOn w:val="a0"/>
+    <w:rsid w:val="006671F7"/>
+  </w:style>
 </w:styles>
 </file>
 

</xml_diff>

<commit_message>
XSS protection is provided
</commit_message>
<xml_diff>
--- a/tests/Ошибки в RentEase.docx
+++ b/tests/Ошибки в RentEase.docx
@@ -3208,6 +3208,9 @@
     <w:p/>
     <w:p>
       <w:r>
+        <w:rPr>
+          <w:noProof/>
+        </w:rPr>
         <w:lastRenderedPageBreak/>
         <w:drawing>
           <wp:inline distT="0" distB="0" distL="0" distR="0" wp14:anchorId="3B198C79" wp14:editId="7B61B70B">
@@ -3250,6 +3253,8 @@
       <w:pPr>
         <w:rPr>
           <w:rFonts w:ascii="Times New Roman" w:hAnsi="Times New Roman" w:cs="Times New Roman"/>
+          <w:sz w:val="24"/>
+          <w:szCs w:val="24"/>
         </w:rPr>
       </w:pPr>
       <w:r>
@@ -3265,7 +3270,6 @@
           <w:rFonts w:ascii="Times New Roman" w:hAnsi="Times New Roman" w:cs="Times New Roman"/>
           <w:sz w:val="24"/>
           <w:szCs w:val="24"/>
-          <w:lang w:val="en-US"/>
         </w:rPr>
         <w:t>:</w:t>
       </w:r>
@@ -3276,6 +3280,162 @@
           <w:szCs w:val="24"/>
         </w:rPr>
         <w:t xml:space="preserve"> установить pip install PyJWT</w:t>
+      </w:r>
+    </w:p>
+    <w:p>
+      <w:pPr>
+        <w:rPr>
+          <w:rFonts w:ascii="Times New Roman" w:hAnsi="Times New Roman" w:cs="Times New Roman"/>
+          <w:sz w:val="24"/>
+          <w:szCs w:val="24"/>
+        </w:rPr>
+      </w:pPr>
+    </w:p>
+    <w:p>
+      <w:pPr>
+        <w:rPr>
+          <w:rFonts w:ascii="Times New Roman" w:hAnsi="Times New Roman" w:cs="Times New Roman"/>
+        </w:rPr>
+      </w:pPr>
+      <w:r>
+        <w:rPr>
+          <w:rFonts w:ascii="Times New Roman" w:hAnsi="Times New Roman" w:cs="Times New Roman"/>
+        </w:rPr>
+        <w:drawing>
+          <wp:inline distT="0" distB="0" distL="0" distR="0" wp14:anchorId="0671245C" wp14:editId="55541C71">
+            <wp:extent cx="5940425" cy="3088640"/>
+            <wp:effectExtent l="0" t="0" r="3175" b="0"/>
+            <wp:docPr id="9" name="Рисунок 9"/>
+            <wp:cNvGraphicFramePr>
+              <a:graphicFrameLocks xmlns:a="http://schemas.openxmlformats.org/drawingml/2006/main" noChangeAspect="1"/>
+            </wp:cNvGraphicFramePr>
+            <a:graphic xmlns:a="http://schemas.openxmlformats.org/drawingml/2006/main">
+              <a:graphicData uri="http://schemas.openxmlformats.org/drawingml/2006/picture">
+                <pic:pic xmlns:pic="http://schemas.openxmlformats.org/drawingml/2006/picture">
+                  <pic:nvPicPr>
+                    <pic:cNvPr id="1" name=""/>
+                    <pic:cNvPicPr/>
+                  </pic:nvPicPr>
+                  <pic:blipFill>
+                    <a:blip r:embed="rId12"/>
+                    <a:stretch>
+                      <a:fillRect/>
+                    </a:stretch>
+                  </pic:blipFill>
+                  <pic:spPr>
+                    <a:xfrm>
+                      <a:off x="0" y="0"/>
+                      <a:ext cx="5940425" cy="3088640"/>
+                    </a:xfrm>
+                    <a:prstGeom prst="rect">
+                      <a:avLst/>
+                    </a:prstGeom>
+                  </pic:spPr>
+                </pic:pic>
+              </a:graphicData>
+            </a:graphic>
+          </wp:inline>
+        </w:drawing>
+      </w:r>
+    </w:p>
+    <w:p>
+      <w:pPr>
+        <w:rPr>
+          <w:rFonts w:ascii="Times New Roman" w:hAnsi="Times New Roman" w:cs="Times New Roman"/>
+        </w:rPr>
+      </w:pPr>
+      <w:r>
+        <w:rPr>
+          <w:rFonts w:ascii="Times New Roman" w:hAnsi="Times New Roman" w:cs="Times New Roman"/>
+        </w:rPr>
+        <w:t>Страница парализована</w:t>
+      </w:r>
+      <w:r>
+        <w:rPr>
+          <w:rFonts w:ascii="Times New Roman" w:hAnsi="Times New Roman" w:cs="Times New Roman"/>
+        </w:rPr>
+        <w:t>,</w:t>
+      </w:r>
+      <w:r>
+        <w:rPr>
+          <w:rFonts w:ascii="Times New Roman" w:hAnsi="Times New Roman" w:cs="Times New Roman"/>
+        </w:rPr>
+        <w:t xml:space="preserve"> кнопки не нажимаются. </w:t>
+      </w:r>
+      <w:r>
+        <w:rPr>
+          <w:rFonts w:ascii="Segoe UI" w:hAnsi="Segoe UI" w:cs="Segoe UI"/>
+          <w:color w:val="0F1115"/>
+          <w:shd w:val="clear" w:color="auto" w:fill="FFFFFF"/>
+        </w:rPr>
+        <w:t>При запуске веб-приложения RentEase в консоли браузера возникали следующие ошибки, связанные с политикой безопасности контента (Content Security Policy)</w:t>
+      </w:r>
+      <w:r>
+        <w:rPr>
+          <w:rFonts w:ascii="Segoe UI" w:hAnsi="Segoe UI" w:cs="Segoe UI"/>
+          <w:color w:val="0F1115"/>
+          <w:shd w:val="clear" w:color="auto" w:fill="FFFFFF"/>
+        </w:rPr>
+        <w:t xml:space="preserve"> Решение</w:t>
+      </w:r>
+      <w:r>
+        <w:rPr>
+          <w:rFonts w:ascii="Segoe UI" w:hAnsi="Segoe UI" w:cs="Segoe UI"/>
+          <w:color w:val="0F1115"/>
+          <w:shd w:val="clear" w:color="auto" w:fill="FFFFFF"/>
+          <w:lang w:val="en-US"/>
+        </w:rPr>
+        <w:t>:</w:t>
+      </w:r>
+      <w:r>
+        <w:rPr>
+          <w:rFonts w:ascii="Segoe UI" w:hAnsi="Segoe UI" w:cs="Segoe UI"/>
+          <w:color w:val="0F1115"/>
+          <w:shd w:val="clear" w:color="auto" w:fill="FFFFFF"/>
+        </w:rPr>
+        <w:t xml:space="preserve"> </w:t>
+      </w:r>
+      <w:r>
+        <w:rPr>
+          <w:rFonts w:ascii="Segoe UI" w:hAnsi="Segoe UI" w:cs="Segoe UI"/>
+          <w:color w:val="0F1115"/>
+          <w:shd w:val="clear" w:color="auto" w:fill="FFFFFF"/>
+        </w:rPr>
+        <w:t>В файле </w:t>
+      </w:r>
+      <w:r>
+        <w:rPr>
+          <w:rStyle w:val="HTML1"/>
+          <w:rFonts w:ascii="Consolas" w:eastAsiaTheme="minorHAnsi" w:hAnsi="Consolas"/>
+          <w:color w:val="0F1115"/>
+          <w:shd w:val="clear" w:color="auto" w:fill="EBEEF2"/>
+        </w:rPr>
+        <w:t>app.py</w:t>
+      </w:r>
+      <w:r>
+        <w:rPr>
+          <w:rFonts w:ascii="Segoe UI" w:hAnsi="Segoe UI" w:cs="Segoe UI"/>
+          <w:color w:val="0F1115"/>
+          <w:shd w:val="clear" w:color="auto" w:fill="FFFFFF"/>
+        </w:rPr>
+        <w:t> исправлен middleware </w:t>
+      </w:r>
+      <w:r>
+        <w:rPr>
+          <w:rStyle w:val="HTML1"/>
+          <w:rFonts w:ascii="Consolas" w:eastAsiaTheme="minorHAnsi" w:hAnsi="Consolas"/>
+          <w:color w:val="0F1115"/>
+          <w:shd w:val="clear" w:color="auto" w:fill="EBEEF2"/>
+        </w:rPr>
+        <w:t>SecurityHeadersMiddleware</w:t>
+      </w:r>
+      <w:r>
+        <w:rPr>
+          <w:rFonts w:ascii="Segoe UI" w:hAnsi="Segoe UI" w:cs="Segoe UI"/>
+          <w:color w:val="0F1115"/>
+          <w:shd w:val="clear" w:color="auto" w:fill="FFFFFF"/>
+        </w:rPr>
+        <w:t>:</w:t>
       </w:r>
     </w:p>
     <w:p/>
@@ -3771,6 +3931,19 @@
     <w:basedOn w:val="a0"/>
     <w:rsid w:val="006671F7"/>
   </w:style>
+  <w:style w:type="character" w:styleId="HTML1">
+    <w:name w:val="HTML Code"/>
+    <w:basedOn w:val="a0"/>
+    <w:uiPriority w:val="99"/>
+    <w:semiHidden/>
+    <w:unhideWhenUsed/>
+    <w:rsid w:val="00C55A81"/>
+    <w:rPr>
+      <w:rFonts w:ascii="Courier New" w:eastAsia="Times New Roman" w:hAnsi="Courier New" w:cs="Courier New"/>
+      <w:sz w:val="20"/>
+      <w:szCs w:val="20"/>
+    </w:rPr>
+  </w:style>
 </w:styles>
 </file>
 

</xml_diff>

<commit_message>
Fixed audit log display errors. Updated the top panel on other pages. Significantly updated the course project report
</commit_message>
<xml_diff>
--- a/tests/Ошибки в RentEase.docx
+++ b/tests/Ошибки в RentEase.docx
@@ -3300,6 +3300,7 @@
       <w:r>
         <w:rPr>
           <w:rFonts w:ascii="Times New Roman" w:hAnsi="Times New Roman" w:cs="Times New Roman"/>
+          <w:noProof/>
         </w:rPr>
         <w:drawing>
           <wp:inline distT="0" distB="0" distL="0" distR="0" wp14:anchorId="0671245C" wp14:editId="55541C71">
@@ -3341,34 +3342,28 @@
     <w:p>
       <w:pPr>
         <w:rPr>
-          <w:rFonts w:ascii="Times New Roman" w:hAnsi="Times New Roman" w:cs="Times New Roman"/>
-        </w:rPr>
-      </w:pPr>
-      <w:r>
-        <w:rPr>
-          <w:rFonts w:ascii="Times New Roman" w:hAnsi="Times New Roman" w:cs="Times New Roman"/>
-        </w:rPr>
-        <w:t>Страница парализована</w:t>
-      </w:r>
-      <w:r>
-        <w:rPr>
-          <w:rFonts w:ascii="Times New Roman" w:hAnsi="Times New Roman" w:cs="Times New Roman"/>
-        </w:rPr>
-        <w:t>,</w:t>
-      </w:r>
-      <w:r>
-        <w:rPr>
-          <w:rFonts w:ascii="Times New Roman" w:hAnsi="Times New Roman" w:cs="Times New Roman"/>
-        </w:rPr>
-        <w:t xml:space="preserve"> кнопки не нажимаются. </w:t>
-      </w:r>
-      <w:r>
-        <w:rPr>
           <w:rFonts w:ascii="Segoe UI" w:hAnsi="Segoe UI" w:cs="Segoe UI"/>
           <w:color w:val="0F1115"/>
           <w:shd w:val="clear" w:color="auto" w:fill="FFFFFF"/>
         </w:rPr>
-        <w:t>При запуске веб-приложения RentEase в консоли браузера возникали следующие ошибки, связанные с политикой безопасности контента (Content Security Policy)</w:t>
+      </w:pPr>
+      <w:r>
+        <w:rPr>
+          <w:rFonts w:ascii="Times New Roman" w:hAnsi="Times New Roman" w:cs="Times New Roman"/>
+        </w:rPr>
+        <w:t>Страница парализована</w:t>
+      </w:r>
+      <w:r>
+        <w:rPr>
+          <w:rFonts w:ascii="Times New Roman" w:hAnsi="Times New Roman" w:cs="Times New Roman"/>
+        </w:rPr>
+        <w:t>,</w:t>
+      </w:r>
+      <w:r>
+        <w:rPr>
+          <w:rFonts w:ascii="Times New Roman" w:hAnsi="Times New Roman" w:cs="Times New Roman"/>
+        </w:rPr>
+        <w:t xml:space="preserve"> кнопки не нажимаются. </w:t>
       </w:r>
       <w:r>
         <w:rPr>
@@ -3376,14 +3371,13 @@
           <w:color w:val="0F1115"/>
           <w:shd w:val="clear" w:color="auto" w:fill="FFFFFF"/>
         </w:rPr>
-        <w:t xml:space="preserve"> Решение</w:t>
+        <w:t>При запуске веб-приложения RentEase в консоли браузера возникали следующие ошибки, связанные с политикой безопасности контента (Content Security Policy) Решение</w:t>
       </w:r>
       <w:r>
         <w:rPr>
           <w:rFonts w:ascii="Segoe UI" w:hAnsi="Segoe UI" w:cs="Segoe UI"/>
           <w:color w:val="0F1115"/>
           <w:shd w:val="clear" w:color="auto" w:fill="FFFFFF"/>
-          <w:lang w:val="en-US"/>
         </w:rPr>
         <w:t>:</w:t>
       </w:r>
@@ -3393,15 +3387,7 @@
           <w:color w:val="0F1115"/>
           <w:shd w:val="clear" w:color="auto" w:fill="FFFFFF"/>
         </w:rPr>
-        <w:t xml:space="preserve"> </w:t>
-      </w:r>
-      <w:r>
-        <w:rPr>
-          <w:rFonts w:ascii="Segoe UI" w:hAnsi="Segoe UI" w:cs="Segoe UI"/>
-          <w:color w:val="0F1115"/>
-          <w:shd w:val="clear" w:color="auto" w:fill="FFFFFF"/>
-        </w:rPr>
-        <w:t>В файле </w:t>
+        <w:t xml:space="preserve"> В файле </w:t>
       </w:r>
       <w:r>
         <w:rPr>
@@ -3438,8 +3424,857 @@
         <w:t>:</w:t>
       </w:r>
     </w:p>
-    <w:p/>
-    <w:p/>
+    <w:p>
+      <w:pPr>
+        <w:rPr>
+          <w:rFonts w:ascii="Times New Roman" w:hAnsi="Times New Roman" w:cs="Times New Roman"/>
+          <w:lang w:val="en-US"/>
+        </w:rPr>
+      </w:pPr>
+      <w:r>
+        <w:rPr>
+          <w:rFonts w:ascii="Times New Roman" w:hAnsi="Times New Roman" w:cs="Times New Roman"/>
+          <w:lang w:val="en-US"/>
+        </w:rPr>
+        <w:t># app.py</w:t>
+      </w:r>
+    </w:p>
+    <w:p>
+      <w:pPr>
+        <w:rPr>
+          <w:rFonts w:ascii="Times New Roman" w:hAnsi="Times New Roman" w:cs="Times New Roman"/>
+          <w:lang w:val="en-US"/>
+        </w:rPr>
+      </w:pPr>
+    </w:p>
+    <w:p>
+      <w:pPr>
+        <w:rPr>
+          <w:rFonts w:ascii="Times New Roman" w:hAnsi="Times New Roman" w:cs="Times New Roman"/>
+          <w:lang w:val="en-US"/>
+        </w:rPr>
+      </w:pPr>
+      <w:r>
+        <w:rPr>
+          <w:rFonts w:ascii="Times New Roman" w:hAnsi="Times New Roman" w:cs="Times New Roman"/>
+          <w:lang w:val="en-US"/>
+        </w:rPr>
+        <w:t>from starlette.middleware.base import BaseHTTPMiddleware</w:t>
+      </w:r>
+    </w:p>
+    <w:p>
+      <w:pPr>
+        <w:rPr>
+          <w:rFonts w:ascii="Times New Roman" w:hAnsi="Times New Roman" w:cs="Times New Roman"/>
+          <w:lang w:val="en-US"/>
+        </w:rPr>
+      </w:pPr>
+    </w:p>
+    <w:p>
+      <w:pPr>
+        <w:rPr>
+          <w:rFonts w:ascii="Times New Roman" w:hAnsi="Times New Roman" w:cs="Times New Roman"/>
+          <w:lang w:val="en-US"/>
+        </w:rPr>
+      </w:pPr>
+      <w:r>
+        <w:rPr>
+          <w:rFonts w:ascii="Times New Roman" w:hAnsi="Times New Roman" w:cs="Times New Roman"/>
+          <w:lang w:val="en-US"/>
+        </w:rPr>
+        <w:lastRenderedPageBreak/>
+        <w:t>class SecurityHeadersMiddleware(BaseHTTPMiddleware):</w:t>
+      </w:r>
+    </w:p>
+    <w:p>
+      <w:pPr>
+        <w:rPr>
+          <w:rFonts w:ascii="Times New Roman" w:hAnsi="Times New Roman" w:cs="Times New Roman"/>
+          <w:lang w:val="en-US"/>
+        </w:rPr>
+      </w:pPr>
+      <w:r>
+        <w:rPr>
+          <w:rFonts w:ascii="Times New Roman" w:hAnsi="Times New Roman" w:cs="Times New Roman"/>
+          <w:lang w:val="en-US"/>
+        </w:rPr>
+        <w:t xml:space="preserve">    async def dispatch(self, request, call_next):</w:t>
+      </w:r>
+    </w:p>
+    <w:p>
+      <w:pPr>
+        <w:rPr>
+          <w:rFonts w:ascii="Times New Roman" w:hAnsi="Times New Roman" w:cs="Times New Roman"/>
+          <w:lang w:val="en-US"/>
+        </w:rPr>
+      </w:pPr>
+      <w:r>
+        <w:rPr>
+          <w:rFonts w:ascii="Times New Roman" w:hAnsi="Times New Roman" w:cs="Times New Roman"/>
+          <w:lang w:val="en-US"/>
+        </w:rPr>
+        <w:t xml:space="preserve">        response = await call_next(request)</w:t>
+      </w:r>
+    </w:p>
+    <w:p>
+      <w:pPr>
+        <w:rPr>
+          <w:rFonts w:ascii="Times New Roman" w:hAnsi="Times New Roman" w:cs="Times New Roman"/>
+          <w:lang w:val="en-US"/>
+        </w:rPr>
+      </w:pPr>
+      <w:r>
+        <w:rPr>
+          <w:rFonts w:ascii="Times New Roman" w:hAnsi="Times New Roman" w:cs="Times New Roman"/>
+          <w:lang w:val="en-US"/>
+        </w:rPr>
+        <w:t xml:space="preserve">        </w:t>
+      </w:r>
+    </w:p>
+    <w:p>
+      <w:pPr>
+        <w:rPr>
+          <w:rFonts w:ascii="Times New Roman" w:hAnsi="Times New Roman" w:cs="Times New Roman"/>
+          <w:lang w:val="en-US"/>
+        </w:rPr>
+      </w:pPr>
+      <w:r>
+        <w:rPr>
+          <w:rFonts w:ascii="Times New Roman" w:hAnsi="Times New Roman" w:cs="Times New Roman"/>
+          <w:lang w:val="en-US"/>
+        </w:rPr>
+        <w:t xml:space="preserve">        # </w:t>
+      </w:r>
+      <w:r>
+        <w:rPr>
+          <w:rFonts w:ascii="Times New Roman" w:hAnsi="Times New Roman" w:cs="Times New Roman"/>
+        </w:rPr>
+        <w:t>Базовые</w:t>
+      </w:r>
+      <w:r>
+        <w:rPr>
+          <w:rFonts w:ascii="Times New Roman" w:hAnsi="Times New Roman" w:cs="Times New Roman"/>
+          <w:lang w:val="en-US"/>
+        </w:rPr>
+        <w:t xml:space="preserve"> </w:t>
+      </w:r>
+      <w:r>
+        <w:rPr>
+          <w:rFonts w:ascii="Times New Roman" w:hAnsi="Times New Roman" w:cs="Times New Roman"/>
+        </w:rPr>
+        <w:t>заголовки</w:t>
+      </w:r>
+      <w:r>
+        <w:rPr>
+          <w:rFonts w:ascii="Times New Roman" w:hAnsi="Times New Roman" w:cs="Times New Roman"/>
+          <w:lang w:val="en-US"/>
+        </w:rPr>
+        <w:t xml:space="preserve"> </w:t>
+      </w:r>
+      <w:r>
+        <w:rPr>
+          <w:rFonts w:ascii="Times New Roman" w:hAnsi="Times New Roman" w:cs="Times New Roman"/>
+        </w:rPr>
+        <w:t>безопасности</w:t>
+      </w:r>
+    </w:p>
+    <w:p>
+      <w:pPr>
+        <w:rPr>
+          <w:rFonts w:ascii="Times New Roman" w:hAnsi="Times New Roman" w:cs="Times New Roman"/>
+          <w:lang w:val="en-US"/>
+        </w:rPr>
+      </w:pPr>
+      <w:r>
+        <w:rPr>
+          <w:rFonts w:ascii="Times New Roman" w:hAnsi="Times New Roman" w:cs="Times New Roman"/>
+          <w:lang w:val="en-US"/>
+        </w:rPr>
+        <w:t xml:space="preserve">        response.headers['X-Frame-Options'] = 'DENY'</w:t>
+      </w:r>
+    </w:p>
+    <w:p>
+      <w:pPr>
+        <w:rPr>
+          <w:rFonts w:ascii="Times New Roman" w:hAnsi="Times New Roman" w:cs="Times New Roman"/>
+          <w:lang w:val="en-US"/>
+        </w:rPr>
+      </w:pPr>
+      <w:r>
+        <w:rPr>
+          <w:rFonts w:ascii="Times New Roman" w:hAnsi="Times New Roman" w:cs="Times New Roman"/>
+          <w:lang w:val="en-US"/>
+        </w:rPr>
+        <w:t xml:space="preserve">        response.headers['X-Content-Type-Options'] = 'nosniff'</w:t>
+      </w:r>
+    </w:p>
+    <w:p>
+      <w:pPr>
+        <w:rPr>
+          <w:rFonts w:ascii="Times New Roman" w:hAnsi="Times New Roman" w:cs="Times New Roman"/>
+          <w:lang w:val="en-US"/>
+        </w:rPr>
+      </w:pPr>
+      <w:r>
+        <w:rPr>
+          <w:rFonts w:ascii="Times New Roman" w:hAnsi="Times New Roman" w:cs="Times New Roman"/>
+          <w:lang w:val="en-US"/>
+        </w:rPr>
+        <w:t xml:space="preserve">        response.headers['X-XSS-Protection'] = '1; mode=block'</w:t>
+      </w:r>
+    </w:p>
+    <w:p>
+      <w:pPr>
+        <w:rPr>
+          <w:rFonts w:ascii="Times New Roman" w:hAnsi="Times New Roman" w:cs="Times New Roman"/>
+          <w:lang w:val="en-US"/>
+        </w:rPr>
+      </w:pPr>
+      <w:r>
+        <w:rPr>
+          <w:rFonts w:ascii="Times New Roman" w:hAnsi="Times New Roman" w:cs="Times New Roman"/>
+          <w:lang w:val="en-US"/>
+        </w:rPr>
+        <w:t xml:space="preserve">        </w:t>
+      </w:r>
+    </w:p>
+    <w:p>
+      <w:pPr>
+        <w:rPr>
+          <w:rFonts w:ascii="Times New Roman" w:hAnsi="Times New Roman" w:cs="Times New Roman"/>
+          <w:lang w:val="en-US"/>
+        </w:rPr>
+      </w:pPr>
+      <w:r>
+        <w:rPr>
+          <w:rFonts w:ascii="Times New Roman" w:hAnsi="Times New Roman" w:cs="Times New Roman"/>
+          <w:lang w:val="en-US"/>
+        </w:rPr>
+        <w:t xml:space="preserve">        # </w:t>
+      </w:r>
+      <w:r>
+        <w:rPr>
+          <w:rFonts w:ascii="Times New Roman" w:hAnsi="Times New Roman" w:cs="Times New Roman"/>
+        </w:rPr>
+        <w:t>Исправленный</w:t>
+      </w:r>
+      <w:r>
+        <w:rPr>
+          <w:rFonts w:ascii="Times New Roman" w:hAnsi="Times New Roman" w:cs="Times New Roman"/>
+          <w:lang w:val="en-US"/>
+        </w:rPr>
+        <w:t xml:space="preserve"> CSP </w:t>
+      </w:r>
+      <w:r>
+        <w:rPr>
+          <w:rFonts w:ascii="Times New Roman" w:hAnsi="Times New Roman" w:cs="Times New Roman"/>
+        </w:rPr>
+        <w:t>с</w:t>
+      </w:r>
+      <w:r>
+        <w:rPr>
+          <w:rFonts w:ascii="Times New Roman" w:hAnsi="Times New Roman" w:cs="Times New Roman"/>
+          <w:lang w:val="en-US"/>
+        </w:rPr>
+        <w:t xml:space="preserve"> </w:t>
+      </w:r>
+      <w:r>
+        <w:rPr>
+          <w:rFonts w:ascii="Times New Roman" w:hAnsi="Times New Roman" w:cs="Times New Roman"/>
+        </w:rPr>
+        <w:t>необходимыми</w:t>
+      </w:r>
+      <w:r>
+        <w:rPr>
+          <w:rFonts w:ascii="Times New Roman" w:hAnsi="Times New Roman" w:cs="Times New Roman"/>
+          <w:lang w:val="en-US"/>
+        </w:rPr>
+        <w:t xml:space="preserve"> </w:t>
+      </w:r>
+      <w:r>
+        <w:rPr>
+          <w:rFonts w:ascii="Times New Roman" w:hAnsi="Times New Roman" w:cs="Times New Roman"/>
+        </w:rPr>
+        <w:t>источниками</w:t>
+      </w:r>
+    </w:p>
+    <w:p>
+      <w:pPr>
+        <w:rPr>
+          <w:rFonts w:ascii="Times New Roman" w:hAnsi="Times New Roman" w:cs="Times New Roman"/>
+          <w:lang w:val="en-US"/>
+        </w:rPr>
+      </w:pPr>
+      <w:r>
+        <w:rPr>
+          <w:rFonts w:ascii="Times New Roman" w:hAnsi="Times New Roman" w:cs="Times New Roman"/>
+          <w:lang w:val="en-US"/>
+        </w:rPr>
+        <w:t xml:space="preserve">        response.headers['Content-Security-Policy'] = (</w:t>
+      </w:r>
+    </w:p>
+    <w:p>
+      <w:pPr>
+        <w:rPr>
+          <w:rFonts w:ascii="Times New Roman" w:hAnsi="Times New Roman" w:cs="Times New Roman"/>
+          <w:lang w:val="en-US"/>
+        </w:rPr>
+      </w:pPr>
+      <w:r>
+        <w:rPr>
+          <w:rFonts w:ascii="Times New Roman" w:hAnsi="Times New Roman" w:cs="Times New Roman"/>
+          <w:lang w:val="en-US"/>
+        </w:rPr>
+        <w:t xml:space="preserve">            "default-src 'self'; "</w:t>
+      </w:r>
+    </w:p>
+    <w:p>
+      <w:pPr>
+        <w:rPr>
+          <w:rFonts w:ascii="Times New Roman" w:hAnsi="Times New Roman" w:cs="Times New Roman"/>
+          <w:lang w:val="en-US"/>
+        </w:rPr>
+      </w:pPr>
+      <w:r>
+        <w:rPr>
+          <w:rFonts w:ascii="Times New Roman" w:hAnsi="Times New Roman" w:cs="Times New Roman"/>
+          <w:lang w:val="en-US"/>
+        </w:rPr>
+        <w:t xml:space="preserve">            "script-src 'self' 'unsafe-inline' 'unsafe-eval' "</w:t>
+      </w:r>
+    </w:p>
+    <w:p>
+      <w:pPr>
+        <w:rPr>
+          <w:rFonts w:ascii="Times New Roman" w:hAnsi="Times New Roman" w:cs="Times New Roman"/>
+          <w:lang w:val="en-US"/>
+        </w:rPr>
+      </w:pPr>
+      <w:r>
+        <w:rPr>
+          <w:rFonts w:ascii="Times New Roman" w:hAnsi="Times New Roman" w:cs="Times New Roman"/>
+          <w:lang w:val="en-US"/>
+        </w:rPr>
+        <w:t xml:space="preserve">            "https://cdn.jsdelivr.net https://unpkg.com; "</w:t>
+      </w:r>
+    </w:p>
+    <w:p>
+      <w:pPr>
+        <w:rPr>
+          <w:rFonts w:ascii="Times New Roman" w:hAnsi="Times New Roman" w:cs="Times New Roman"/>
+          <w:lang w:val="en-US"/>
+        </w:rPr>
+      </w:pPr>
+      <w:r>
+        <w:rPr>
+          <w:rFonts w:ascii="Times New Roman" w:hAnsi="Times New Roman" w:cs="Times New Roman"/>
+          <w:lang w:val="en-US"/>
+        </w:rPr>
+        <w:t xml:space="preserve">            "style-src 'self' 'unsafe-inline'; "</w:t>
+      </w:r>
+    </w:p>
+    <w:p>
+      <w:pPr>
+        <w:rPr>
+          <w:rFonts w:ascii="Times New Roman" w:hAnsi="Times New Roman" w:cs="Times New Roman"/>
+          <w:lang w:val="en-US"/>
+        </w:rPr>
+      </w:pPr>
+      <w:r>
+        <w:rPr>
+          <w:rFonts w:ascii="Times New Roman" w:hAnsi="Times New Roman" w:cs="Times New Roman"/>
+          <w:lang w:val="en-US"/>
+        </w:rPr>
+        <w:t xml:space="preserve">            "img-src 'self' data: blob:; "</w:t>
+      </w:r>
+    </w:p>
+    <w:p>
+      <w:pPr>
+        <w:rPr>
+          <w:rFonts w:ascii="Times New Roman" w:hAnsi="Times New Roman" w:cs="Times New Roman"/>
+          <w:lang w:val="en-US"/>
+        </w:rPr>
+      </w:pPr>
+      <w:r>
+        <w:rPr>
+          <w:rFonts w:ascii="Times New Roman" w:hAnsi="Times New Roman" w:cs="Times New Roman"/>
+          <w:lang w:val="en-US"/>
+        </w:rPr>
+        <w:t xml:space="preserve">            "connect-src 'self' ws: wss: https://cdn.jsdelivr.net https://api.hh.ru; "</w:t>
+      </w:r>
+    </w:p>
+    <w:p>
+      <w:pPr>
+        <w:rPr>
+          <w:rFonts w:ascii="Times New Roman" w:hAnsi="Times New Roman" w:cs="Times New Roman"/>
+          <w:lang w:val="en-US"/>
+        </w:rPr>
+      </w:pPr>
+      <w:r>
+        <w:rPr>
+          <w:rFonts w:ascii="Times New Roman" w:hAnsi="Times New Roman" w:cs="Times New Roman"/>
+          <w:lang w:val="en-US"/>
+        </w:rPr>
+        <w:t xml:space="preserve">            "font-src 'self' data:;"</w:t>
+      </w:r>
+    </w:p>
+    <w:p>
+      <w:pPr>
+        <w:rPr>
+          <w:rFonts w:ascii="Times New Roman" w:hAnsi="Times New Roman" w:cs="Times New Roman"/>
+          <w:lang w:val="en-US"/>
+        </w:rPr>
+      </w:pPr>
+      <w:r>
+        <w:rPr>
+          <w:rFonts w:ascii="Times New Roman" w:hAnsi="Times New Roman" w:cs="Times New Roman"/>
+          <w:lang w:val="en-US"/>
+        </w:rPr>
+        <w:t xml:space="preserve">        )</w:t>
+      </w:r>
+    </w:p>
+    <w:p>
+      <w:pPr>
+        <w:rPr>
+          <w:rFonts w:ascii="Times New Roman" w:hAnsi="Times New Roman" w:cs="Times New Roman"/>
+          <w:lang w:val="en-US"/>
+        </w:rPr>
+      </w:pPr>
+      <w:r>
+        <w:rPr>
+          <w:rFonts w:ascii="Times New Roman" w:hAnsi="Times New Roman" w:cs="Times New Roman"/>
+          <w:lang w:val="en-US"/>
+        </w:rPr>
+        <w:t xml:space="preserve">        </w:t>
+      </w:r>
+    </w:p>
+    <w:p>
+      <w:pPr>
+        <w:rPr>
+          <w:rFonts w:ascii="Times New Roman" w:hAnsi="Times New Roman" w:cs="Times New Roman"/>
+          <w:lang w:val="en-US"/>
+        </w:rPr>
+      </w:pPr>
+      <w:r>
+        <w:rPr>
+          <w:rFonts w:ascii="Times New Roman" w:hAnsi="Times New Roman" w:cs="Times New Roman"/>
+          <w:lang w:val="en-US"/>
+        </w:rPr>
+        <w:t xml:space="preserve">        return response</w:t>
+      </w:r>
+    </w:p>
+    <w:p>
+      <w:pPr>
+        <w:rPr>
+          <w:rFonts w:ascii="Times New Roman" w:hAnsi="Times New Roman" w:cs="Times New Roman"/>
+          <w:lang w:val="en-US"/>
+        </w:rPr>
+      </w:pPr>
+    </w:p>
+    <w:p>
+      <w:pPr>
+        <w:rPr>
+          <w:rFonts w:ascii="Times New Roman" w:hAnsi="Times New Roman" w:cs="Times New Roman"/>
+          <w:lang w:val="en-US"/>
+        </w:rPr>
+      </w:pPr>
+      <w:r>
+        <w:rPr>
+          <w:rFonts w:ascii="Times New Roman" w:hAnsi="Times New Roman" w:cs="Times New Roman"/>
+          <w:lang w:val="en-US"/>
+        </w:rPr>
+        <w:t xml:space="preserve"># </w:t>
+      </w:r>
+      <w:r>
+        <w:rPr>
+          <w:rFonts w:ascii="Times New Roman" w:hAnsi="Times New Roman" w:cs="Times New Roman"/>
+        </w:rPr>
+        <w:t>Подключение</w:t>
+      </w:r>
+      <w:r>
+        <w:rPr>
+          <w:rFonts w:ascii="Times New Roman" w:hAnsi="Times New Roman" w:cs="Times New Roman"/>
+          <w:lang w:val="en-US"/>
+        </w:rPr>
+        <w:t xml:space="preserve"> middleware</w:t>
+      </w:r>
+    </w:p>
+    <w:p>
+      <w:pPr>
+        <w:rPr>
+          <w:rFonts w:ascii="Times New Roman" w:hAnsi="Times New Roman" w:cs="Times New Roman"/>
+          <w:lang w:val="en-US"/>
+        </w:rPr>
+      </w:pPr>
+      <w:r>
+        <w:rPr>
+          <w:rFonts w:ascii="Times New Roman" w:hAnsi="Times New Roman" w:cs="Times New Roman"/>
+          <w:lang w:val="en-US"/>
+        </w:rPr>
+        <w:t>app.add_middleware(SecurityHeadersMiddleware)</w:t>
+      </w:r>
+    </w:p>
+    <w:p>
+      <w:pPr>
+        <w:rPr>
+          <w:lang w:val="en-US"/>
+        </w:rPr>
+      </w:pPr>
+    </w:p>
+    <w:p>
+      <w:r>
+        <w:drawing>
+          <wp:inline distT="0" distB="0" distL="0" distR="0" wp14:anchorId="05B40764" wp14:editId="668C44B1">
+            <wp:extent cx="3419952" cy="1124107"/>
+            <wp:effectExtent l="0" t="0" r="0" b="0"/>
+            <wp:docPr id="10" name="Рисунок 10"/>
+            <wp:cNvGraphicFramePr>
+              <a:graphicFrameLocks xmlns:a="http://schemas.openxmlformats.org/drawingml/2006/main" noChangeAspect="1"/>
+            </wp:cNvGraphicFramePr>
+            <a:graphic xmlns:a="http://schemas.openxmlformats.org/drawingml/2006/main">
+              <a:graphicData uri="http://schemas.openxmlformats.org/drawingml/2006/picture">
+                <pic:pic xmlns:pic="http://schemas.openxmlformats.org/drawingml/2006/picture">
+                  <pic:nvPicPr>
+                    <pic:cNvPr id="1" name=""/>
+                    <pic:cNvPicPr/>
+                  </pic:nvPicPr>
+                  <pic:blipFill>
+                    <a:blip r:embed="rId13"/>
+                    <a:stretch>
+                      <a:fillRect/>
+                    </a:stretch>
+                  </pic:blipFill>
+                  <pic:spPr>
+                    <a:xfrm>
+                      <a:off x="0" y="0"/>
+                      <a:ext cx="3419952" cy="1124107"/>
+                    </a:xfrm>
+                    <a:prstGeom prst="rect">
+                      <a:avLst/>
+                    </a:prstGeom>
+                  </pic:spPr>
+                </pic:pic>
+              </a:graphicData>
+            </a:graphic>
+          </wp:inline>
+        </w:drawing>
+      </w:r>
+    </w:p>
+    <w:p>
+      <w:r>
+        <w:t>Ошибка при внесении изменении в профиль Решение</w:t>
+      </w:r>
+      <w:r>
+        <w:t xml:space="preserve">: </w:t>
+      </w:r>
+      <w:r>
+        <w:t xml:space="preserve">исправить функцию </w:t>
+      </w:r>
+      <w:r>
+        <w:t>get_db_with_audit</w:t>
+      </w:r>
+    </w:p>
+    <w:p>
+      <w:pPr>
+        <w:rPr>
+          <w:lang w:val="en-US"/>
+        </w:rPr>
+      </w:pPr>
+      <w:r>
+        <w:rPr>
+          <w:lang w:val="en-US"/>
+        </w:rPr>
+        <w:t># app.py</w:t>
+      </w:r>
+    </w:p>
+    <w:p>
+      <w:pPr>
+        <w:rPr>
+          <w:lang w:val="en-US"/>
+        </w:rPr>
+      </w:pPr>
+    </w:p>
+    <w:p>
+      <w:pPr>
+        <w:rPr>
+          <w:lang w:val="en-US"/>
+        </w:rPr>
+      </w:pPr>
+      <w:r>
+        <w:rPr>
+          <w:lang w:val="en-US"/>
+        </w:rPr>
+        <w:t>def get_db_with_audit(</w:t>
+      </w:r>
+    </w:p>
+    <w:p>
+      <w:pPr>
+        <w:rPr>
+          <w:lang w:val="en-US"/>
+        </w:rPr>
+      </w:pPr>
+      <w:r>
+        <w:rPr>
+          <w:lang w:val="en-US"/>
+        </w:rPr>
+        <w:lastRenderedPageBreak/>
+        <w:t xml:space="preserve">    current_user: User = Depends(get_current_user),</w:t>
+      </w:r>
+    </w:p>
+    <w:p>
+      <w:pPr>
+        <w:rPr>
+          <w:lang w:val="en-US"/>
+        </w:rPr>
+      </w:pPr>
+      <w:r>
+        <w:rPr>
+          <w:lang w:val="en-US"/>
+        </w:rPr>
+        <w:t xml:space="preserve">    db: Session = Depends(get_db)</w:t>
+      </w:r>
+    </w:p>
+    <w:p>
+      <w:r>
+        <w:t>):</w:t>
+      </w:r>
+    </w:p>
+    <w:p>
+      <w:r>
+        <w:t xml:space="preserve">    """Dependency для БД с установкой ID пользователя для триггеров аудита"""</w:t>
+      </w:r>
+    </w:p>
+    <w:p>
+      <w:pPr>
+        <w:rPr>
+          <w:lang w:val="en-US"/>
+        </w:rPr>
+      </w:pPr>
+      <w:r>
+        <w:t xml:space="preserve">    </w:t>
+      </w:r>
+      <w:r>
+        <w:rPr>
+          <w:lang w:val="en-US"/>
+        </w:rPr>
+        <w:t>if current_user and current_user.user_id:</w:t>
+      </w:r>
+    </w:p>
+    <w:p>
+      <w:pPr>
+        <w:rPr>
+          <w:lang w:val="en-US"/>
+        </w:rPr>
+      </w:pPr>
+      <w:r>
+        <w:rPr>
+          <w:lang w:val="en-US"/>
+        </w:rPr>
+        <w:t xml:space="preserve">        try:</w:t>
+      </w:r>
+    </w:p>
+    <w:p>
+      <w:pPr>
+        <w:rPr>
+          <w:lang w:val="en-US"/>
+        </w:rPr>
+      </w:pPr>
+      <w:r>
+        <w:rPr>
+          <w:lang w:val="en-US"/>
+        </w:rPr>
+        <w:t xml:space="preserve">            db.execute(text(f"SELECT set_current_user_id({current_user.user_id})"))</w:t>
+      </w:r>
+    </w:p>
+    <w:p>
+      <w:pPr>
+        <w:rPr>
+          <w:lang w:val="en-US"/>
+        </w:rPr>
+      </w:pPr>
+      <w:r>
+        <w:rPr>
+          <w:lang w:val="en-US"/>
+        </w:rPr>
+        <w:t xml:space="preserve">            print(f"</w:t>
+      </w:r>
+      <w:r>
+        <w:rPr>
+          <w:rFonts w:ascii="Segoe UI Emoji" w:hAnsi="Segoe UI Emoji" w:cs="Segoe UI Emoji"/>
+        </w:rPr>
+        <w:t>🔐</w:t>
+      </w:r>
+      <w:r>
+        <w:rPr>
+          <w:lang w:val="en-US"/>
+        </w:rPr>
+        <w:t xml:space="preserve"> </w:t>
+      </w:r>
+      <w:r>
+        <w:t>АУДИТ</w:t>
+      </w:r>
+      <w:r>
+        <w:rPr>
+          <w:lang w:val="en-US"/>
+        </w:rPr>
+        <w:t xml:space="preserve">: </w:t>
+      </w:r>
+      <w:r>
+        <w:t>установлен</w:t>
+      </w:r>
+      <w:r>
+        <w:rPr>
+          <w:lang w:val="en-US"/>
+        </w:rPr>
+        <w:t xml:space="preserve"> user_id = {current_user.user_id} ({current_user.email})")</w:t>
+      </w:r>
+    </w:p>
+    <w:p>
+      <w:pPr>
+        <w:rPr>
+          <w:lang w:val="en-US"/>
+        </w:rPr>
+      </w:pPr>
+      <w:r>
+        <w:rPr>
+          <w:lang w:val="en-US"/>
+        </w:rPr>
+        <w:t xml:space="preserve">        except Exception as e:</w:t>
+      </w:r>
+    </w:p>
+    <w:p>
+      <w:pPr>
+        <w:rPr>
+          <w:lang w:val="en-US"/>
+        </w:rPr>
+      </w:pPr>
+      <w:r>
+        <w:rPr>
+          <w:lang w:val="en-US"/>
+        </w:rPr>
+        <w:t xml:space="preserve">            print(f"</w:t>
+      </w:r>
+      <w:r>
+        <w:rPr>
+          <w:rFonts w:ascii="Segoe UI Emoji" w:hAnsi="Segoe UI Emoji" w:cs="Segoe UI Emoji"/>
+          <w:lang w:val="en-US"/>
+        </w:rPr>
+        <w:t>⚠</w:t>
+      </w:r>
+      <w:r>
+        <w:t>️</w:t>
+      </w:r>
+      <w:r>
+        <w:rPr>
+          <w:lang w:val="en-US"/>
+        </w:rPr>
+        <w:t xml:space="preserve"> </w:t>
+      </w:r>
+      <w:r>
+        <w:t>Ошибка</w:t>
+      </w:r>
+      <w:r>
+        <w:rPr>
+          <w:lang w:val="en-US"/>
+        </w:rPr>
+        <w:t xml:space="preserve"> </w:t>
+      </w:r>
+      <w:r>
+        <w:t>установки</w:t>
+      </w:r>
+      <w:r>
+        <w:rPr>
+          <w:lang w:val="en-US"/>
+        </w:rPr>
+        <w:t xml:space="preserve"> user_id: {e}")</w:t>
+      </w:r>
+    </w:p>
+    <w:p>
+      <w:pPr>
+        <w:rPr>
+          <w:lang w:val="en-US"/>
+        </w:rPr>
+      </w:pPr>
+      <w:r>
+        <w:rPr>
+          <w:lang w:val="en-US"/>
+        </w:rPr>
+        <w:t xml:space="preserve">    else:</w:t>
+      </w:r>
+    </w:p>
+    <w:p>
+      <w:pPr>
+        <w:rPr>
+          <w:lang w:val="en-US"/>
+        </w:rPr>
+      </w:pPr>
+      <w:r>
+        <w:rPr>
+          <w:lang w:val="en-US"/>
+        </w:rPr>
+        <w:t xml:space="preserve">        try:</w:t>
+      </w:r>
+    </w:p>
+    <w:p>
+      <w:pPr>
+        <w:rPr>
+          <w:lang w:val="en-US"/>
+        </w:rPr>
+      </w:pPr>
+      <w:r>
+        <w:rPr>
+          <w:lang w:val="en-US"/>
+        </w:rPr>
+        <w:t xml:space="preserve">            db.execute(text("SELECT set_current_user_id(NULL)"))</w:t>
+      </w:r>
+    </w:p>
+    <w:p>
+      <w:r>
+        <w:rPr>
+          <w:lang w:val="en-US"/>
+        </w:rPr>
+        <w:t xml:space="preserve">        </w:t>
+      </w:r>
+      <w:r>
+        <w:t>except:</w:t>
+      </w:r>
+    </w:p>
+    <w:p>
+      <w:r>
+        <w:t xml:space="preserve">            pass</w:t>
+      </w:r>
+    </w:p>
+    <w:p>
+      <w:r>
+        <w:t xml:space="preserve">    return db</w:t>
+      </w:r>
+    </w:p>
+    <w:p>
+      <w:r>
+        <w:t>И убедиться в корректности остальных эндпоинтов</w:t>
+      </w:r>
+      <w:r>
+        <w:t>,</w:t>
+      </w:r>
+      <w:r>
+        <w:t xml:space="preserve"> таких как</w:t>
+      </w:r>
+      <w:r>
+        <w:t>,</w:t>
+      </w:r>
+      <w:r>
+        <w:t xml:space="preserve"> например</w:t>
+      </w:r>
+      <w:r>
+        <w:t>,</w:t>
+      </w:r>
+      <w:r>
+        <w:t xml:space="preserve"> </w:t>
+      </w:r>
+      <w:r>
+        <w:t>update_user_profile</w:t>
+      </w:r>
+    </w:p>
     <w:sectPr>
       <w:pgSz w:w="11906" w:h="16838"/>
       <w:pgMar w:top="1134" w:right="850" w:bottom="1134" w:left="1701" w:header="708" w:footer="708" w:gutter="0"/>

</xml_diff>